<commit_message>
add flight MPU6050/filter modules
</commit_message>
<xml_diff>
--- a/基础解析/常见HAL库函数/hal.docx
+++ b/基础解析/常见HAL库函数/hal.docx
@@ -6488,8 +6488,2778 @@
           <w:rFonts w:hint="eastAsia"/>
           <w:lang w:val="en-US" w:eastAsia="zh-CN"/>
         </w:rPr>
+        <w:t>IIC</w:t>
+      </w:r>
+    </w:p>
+    <w:p>
+      <w:pPr>
+        <w:pStyle w:val="3"/>
+        <w:keepNext w:val="0"/>
+        <w:keepLines w:val="0"/>
+        <w:widowControl/>
+        <w:suppressLineNumbers w:val="0"/>
+      </w:pPr>
+      <w:r>
+        <w:t>HAL_I2C_Mem_Write()</w:t>
+      </w:r>
+    </w:p>
+    <w:p>
+      <w:pPr>
+        <w:rPr>
+          <w:rFonts w:hint="eastAsia" w:ascii="宋体" w:hAnsi="宋体" w:eastAsia="宋体" w:cs="宋体"/>
+          <w:sz w:val="24"/>
+          <w:szCs w:val="24"/>
+          <w:lang w:eastAsia="zh-CN"/>
+        </w:rPr>
+      </w:pPr>
+      <w:r>
+        <w:rPr>
+          <w:rFonts w:hint="eastAsia" w:ascii="宋体" w:hAnsi="宋体" w:eastAsia="宋体" w:cs="宋体"/>
+          <w:sz w:val="24"/>
+          <w:szCs w:val="24"/>
+        </w:rPr>
+        <w:t>功能：I2C 向从机指定寄存器地址写入数据</w:t>
+      </w:r>
+      <w:r>
+        <w:rPr>
+          <w:rFonts w:hint="eastAsia" w:ascii="宋体" w:hAnsi="宋体" w:cs="宋体"/>
+          <w:sz w:val="24"/>
+          <w:szCs w:val="24"/>
+          <w:lang w:eastAsia="zh-CN"/>
+        </w:rPr>
+        <w:t>。</w:t>
+      </w:r>
+    </w:p>
+    <w:p>
+      <w:pPr>
+        <w:rPr>
+          <w:rFonts w:hint="eastAsia" w:ascii="宋体" w:hAnsi="宋体" w:eastAsia="宋体" w:cs="宋体"/>
+          <w:sz w:val="24"/>
+          <w:szCs w:val="24"/>
+          <w:lang w:eastAsia="zh-CN"/>
+        </w:rPr>
+      </w:pPr>
+      <w:r>
+        <w:rPr>
+          <w:rFonts w:hint="eastAsia" w:ascii="宋体" w:hAnsi="宋体" w:eastAsia="宋体" w:cs="宋体"/>
+          <w:sz w:val="24"/>
+          <w:szCs w:val="24"/>
+        </w:rPr>
+        <w:t>参数：I2C 句柄指针、从机地址、从机寄存器地址、寄存器地址长度、数据缓冲区指针、写入字节数、超时时间</w:t>
+      </w:r>
+      <w:r>
+        <w:rPr>
+          <w:rFonts w:hint="eastAsia" w:ascii="宋体" w:hAnsi="宋体" w:cs="宋体"/>
+          <w:sz w:val="24"/>
+          <w:szCs w:val="24"/>
+          <w:lang w:eastAsia="zh-CN"/>
+        </w:rPr>
+        <w:t>。</w:t>
+      </w:r>
+    </w:p>
+    <w:p>
+      <w:pPr>
+        <w:rPr>
+          <w:rFonts w:hint="eastAsia" w:ascii="宋体" w:hAnsi="宋体" w:eastAsia="宋体" w:cs="宋体"/>
+          <w:sz w:val="24"/>
+          <w:szCs w:val="24"/>
+          <w:lang w:eastAsia="zh-CN"/>
+        </w:rPr>
+      </w:pPr>
+      <w:r>
+        <w:rPr>
+          <w:rFonts w:hint="eastAsia" w:ascii="宋体" w:hAnsi="宋体" w:eastAsia="宋体" w:cs="宋体"/>
+          <w:sz w:val="24"/>
+          <w:szCs w:val="24"/>
+        </w:rPr>
+        <w:t>返回值：HAL 状态</w:t>
+      </w:r>
+      <w:r>
+        <w:rPr>
+          <w:rFonts w:hint="eastAsia" w:ascii="宋体" w:hAnsi="宋体" w:cs="宋体"/>
+          <w:sz w:val="24"/>
+          <w:szCs w:val="24"/>
+          <w:lang w:eastAsia="zh-CN"/>
+        </w:rPr>
+        <w:t>。</w:t>
+      </w:r>
+    </w:p>
+    <w:sdt>
+      <w:sdtPr>
+        <w:rPr>
+          <w:rFonts w:hint="eastAsia" w:ascii="Consolas" w:hAnsi="宋体" w:eastAsia="宋体" w:cs="宋体"/>
+          <w:kern w:val="2"/>
+          <w:sz w:val="21"/>
+          <w:szCs w:val="24"/>
+          <w:shd w:val="clear"/>
+          <w:lang w:val="en-US" w:eastAsia="zh-CN" w:bidi="ar-SA"/>
+        </w:rPr>
+        <w:id w:val="147456630"/>
+        <w:placeholder>
+          <w:docPart w:val="{f12edd35-ed67-44cf-b75b-0e33027ec69f}"/>
+        </w:placeholder>
+        <w15:appearance w15:val="hidden"/>
+      </w:sdtPr>
+      <w:sdtEndPr>
+        <w:rPr>
+          <w:rFonts w:hint="eastAsia" w:ascii="Consolas" w:hAnsi="宋体" w:eastAsia="宋体" w:cs="宋体"/>
+          <w:kern w:val="2"/>
+          <w:sz w:val="21"/>
+          <w:szCs w:val="24"/>
+          <w:shd w:val="clear"/>
+          <w:lang w:val="en-US" w:eastAsia="zh-CN" w:bidi="ar-SA"/>
+        </w:rPr>
+      </w:sdtEndPr>
+      <w:sdtContent>
+        <w:p>
+          <w:pPr>
+            <w:shd w:val="clear" w:fill="F5F5F5"/>
+            <w:ind w:left="480" w:leftChars="200"/>
+            <w:rPr>
+              <w:rFonts w:hint="eastAsia" w:ascii="Consolas" w:hAnsi="宋体" w:eastAsia="宋体" w:cs="宋体"/>
+              <w:color w:val="252525"/>
+              <w:kern w:val="2"/>
+              <w:sz w:val="21"/>
+              <w:szCs w:val="24"/>
+              <w:shd w:val="clear"/>
+              <w:lang w:val="en-US" w:eastAsia="zh-CN" w:bidi="ar-SA"/>
+            </w:rPr>
+          </w:pPr>
+          <w:r>
+            <w:rPr>
+              <w:rFonts w:hint="eastAsia" w:ascii="Consolas" w:hAnsi="宋体" w:eastAsia="宋体" w:cs="宋体"/>
+              <w:color w:val="1E5FC7"/>
+              <w:kern w:val="2"/>
+              <w:sz w:val="21"/>
+              <w:szCs w:val="24"/>
+              <w:shd w:val="clear"/>
+              <w:lang w:val="en-US" w:eastAsia="zh-CN" w:bidi="ar-SA"/>
+            </w:rPr>
+            <w:t>uint8_t</w:t>
+          </w:r>
+          <w:r>
+            <w:rPr>
+              <w:rFonts w:hint="eastAsia" w:ascii="Consolas" w:hAnsi="宋体" w:eastAsia="宋体" w:cs="宋体"/>
+              <w:color w:val="252525"/>
+              <w:kern w:val="2"/>
+              <w:sz w:val="21"/>
+              <w:szCs w:val="24"/>
+              <w:shd w:val="clear"/>
+              <w:lang w:val="en-US" w:eastAsia="zh-CN" w:bidi="ar-SA"/>
+            </w:rPr>
+            <w:t xml:space="preserve"> </w:t>
+          </w:r>
+          <w:r>
+            <w:rPr>
+              <w:rFonts w:hint="eastAsia" w:ascii="Consolas" w:hAnsi="宋体" w:eastAsia="宋体" w:cs="宋体"/>
+              <w:color w:val="BB2726"/>
+              <w:kern w:val="2"/>
+              <w:sz w:val="21"/>
+              <w:szCs w:val="24"/>
+              <w:shd w:val="clear"/>
+              <w:lang w:val="en-US" w:eastAsia="zh-CN" w:bidi="ar-SA"/>
+            </w:rPr>
+            <w:t>wBuf</w:t>
+          </w:r>
+          <w:r>
+            <w:rPr>
+              <w:rFonts w:hint="eastAsia" w:ascii="Consolas" w:hAnsi="宋体" w:eastAsia="宋体" w:cs="宋体"/>
+              <w:color w:val="252525"/>
+              <w:kern w:val="2"/>
+              <w:sz w:val="21"/>
+              <w:szCs w:val="24"/>
+              <w:shd w:val="clear"/>
+              <w:lang w:val="en-US" w:eastAsia="zh-CN" w:bidi="ar-SA"/>
+            </w:rPr>
+            <w:t>[</w:t>
+          </w:r>
+          <w:r>
+            <w:rPr>
+              <w:rFonts w:hint="eastAsia" w:ascii="Consolas" w:hAnsi="宋体" w:eastAsia="宋体" w:cs="宋体"/>
+              <w:color w:val="C48200"/>
+              <w:kern w:val="2"/>
+              <w:sz w:val="21"/>
+              <w:szCs w:val="24"/>
+              <w:shd w:val="clear"/>
+              <w:lang w:val="en-US" w:eastAsia="zh-CN" w:bidi="ar-SA"/>
+            </w:rPr>
+            <w:t>2</w:t>
+          </w:r>
+          <w:r>
+            <w:rPr>
+              <w:rFonts w:hint="eastAsia" w:ascii="Consolas" w:hAnsi="宋体" w:eastAsia="宋体" w:cs="宋体"/>
+              <w:color w:val="252525"/>
+              <w:kern w:val="2"/>
+              <w:sz w:val="21"/>
+              <w:szCs w:val="24"/>
+              <w:shd w:val="clear"/>
+              <w:lang w:val="en-US" w:eastAsia="zh-CN" w:bidi="ar-SA"/>
+            </w:rPr>
+            <w:t>] = {</w:t>
+          </w:r>
+          <w:r>
+            <w:rPr>
+              <w:rFonts w:hint="eastAsia" w:ascii="Consolas" w:hAnsi="宋体" w:eastAsia="宋体" w:cs="宋体"/>
+              <w:color w:val="C48200"/>
+              <w:kern w:val="2"/>
+              <w:sz w:val="21"/>
+              <w:szCs w:val="24"/>
+              <w:shd w:val="clear"/>
+              <w:lang w:val="en-US" w:eastAsia="zh-CN" w:bidi="ar-SA"/>
+            </w:rPr>
+            <w:t>0x11</w:t>
+          </w:r>
+          <w:r>
+            <w:rPr>
+              <w:rFonts w:hint="eastAsia" w:ascii="Consolas" w:hAnsi="宋体" w:eastAsia="宋体" w:cs="宋体"/>
+              <w:color w:val="252525"/>
+              <w:kern w:val="2"/>
+              <w:sz w:val="21"/>
+              <w:szCs w:val="24"/>
+              <w:shd w:val="clear"/>
+              <w:lang w:val="en-US" w:eastAsia="zh-CN" w:bidi="ar-SA"/>
+            </w:rPr>
+            <w:t>,</w:t>
+          </w:r>
+          <w:r>
+            <w:rPr>
+              <w:rFonts w:hint="eastAsia" w:ascii="Consolas" w:hAnsi="宋体" w:eastAsia="宋体" w:cs="宋体"/>
+              <w:color w:val="C48200"/>
+              <w:kern w:val="2"/>
+              <w:sz w:val="21"/>
+              <w:szCs w:val="24"/>
+              <w:shd w:val="clear"/>
+              <w:lang w:val="en-US" w:eastAsia="zh-CN" w:bidi="ar-SA"/>
+            </w:rPr>
+            <w:t>0x22</w:t>
+          </w:r>
+          <w:r>
+            <w:rPr>
+              <w:rFonts w:hint="eastAsia" w:ascii="Consolas" w:hAnsi="宋体" w:eastAsia="宋体" w:cs="宋体"/>
+              <w:color w:val="252525"/>
+              <w:kern w:val="2"/>
+              <w:sz w:val="21"/>
+              <w:szCs w:val="24"/>
+              <w:shd w:val="clear"/>
+              <w:lang w:val="en-US" w:eastAsia="zh-CN" w:bidi="ar-SA"/>
+            </w:rPr>
+            <w:t>};</w:t>
+          </w:r>
+        </w:p>
+        <w:p>
+          <w:pPr>
+            <w:shd w:val="clear" w:fill="F5F5F5"/>
+            <w:ind w:left="480" w:leftChars="200"/>
+            <w:rPr>
+              <w:rFonts w:hint="eastAsia" w:ascii="Consolas" w:hAnsi="宋体" w:eastAsia="宋体" w:cs="宋体"/>
+              <w:color w:val="252525"/>
+              <w:kern w:val="2"/>
+              <w:sz w:val="21"/>
+              <w:szCs w:val="24"/>
+              <w:shd w:val="clear"/>
+              <w:lang w:val="en-US" w:eastAsia="zh-CN" w:bidi="ar-SA"/>
+            </w:rPr>
+          </w:pPr>
+          <w:r>
+            <w:rPr>
+              <w:rFonts w:hint="eastAsia" w:ascii="Consolas" w:hAnsi="宋体" w:eastAsia="宋体" w:cs="宋体"/>
+              <w:color w:val="909090"/>
+              <w:kern w:val="2"/>
+              <w:sz w:val="21"/>
+              <w:szCs w:val="24"/>
+              <w:shd w:val="clear"/>
+              <w:lang w:val="en-US" w:eastAsia="zh-CN" w:bidi="ar-SA"/>
+            </w:rPr>
+            <w:t>//从机地址0xA0，寄存器0x02，寄存器8位，写入2字节，超时100ms</w:t>
+          </w:r>
+        </w:p>
+        <w:p>
+          <w:pPr>
+            <w:shd w:val="clear" w:fill="F5F5F5"/>
+            <w:ind w:left="480" w:leftChars="200"/>
+            <w:rPr>
+              <w:rFonts w:hint="eastAsia" w:ascii="Consolas" w:hAnsi="宋体" w:eastAsia="宋体" w:cs="宋体"/>
+              <w:sz w:val="21"/>
+              <w:szCs w:val="24"/>
+              <w:shd w:val="clear"/>
+            </w:rPr>
+          </w:pPr>
+          <w:r>
+            <w:rPr>
+              <w:rFonts w:hint="eastAsia" w:ascii="Consolas" w:hAnsi="宋体" w:eastAsia="宋体" w:cs="宋体"/>
+              <w:color w:val="BB2726"/>
+              <w:kern w:val="2"/>
+              <w:sz w:val="21"/>
+              <w:szCs w:val="24"/>
+              <w:shd w:val="clear"/>
+              <w:lang w:val="en-US" w:eastAsia="zh-CN" w:bidi="ar-SA"/>
+            </w:rPr>
+            <w:t>HAL_I2C_Mem_Write</w:t>
+          </w:r>
+          <w:r>
+            <w:rPr>
+              <w:rFonts w:hint="eastAsia" w:ascii="Consolas" w:hAnsi="宋体" w:eastAsia="宋体" w:cs="宋体"/>
+              <w:color w:val="252525"/>
+              <w:kern w:val="2"/>
+              <w:sz w:val="21"/>
+              <w:szCs w:val="24"/>
+              <w:shd w:val="clear"/>
+              <w:lang w:val="en-US" w:eastAsia="zh-CN" w:bidi="ar-SA"/>
+            </w:rPr>
+            <w:t>(&amp;</w:t>
+          </w:r>
+          <w:r>
+            <w:rPr>
+              <w:rFonts w:hint="eastAsia" w:ascii="Consolas" w:hAnsi="宋体" w:eastAsia="宋体" w:cs="宋体"/>
+              <w:color w:val="BB2726"/>
+              <w:kern w:val="2"/>
+              <w:sz w:val="21"/>
+              <w:szCs w:val="24"/>
+              <w:shd w:val="clear"/>
+              <w:lang w:val="en-US" w:eastAsia="zh-CN" w:bidi="ar-SA"/>
+            </w:rPr>
+            <w:t>hi2c1</w:t>
+          </w:r>
+          <w:r>
+            <w:rPr>
+              <w:rFonts w:hint="eastAsia" w:ascii="Consolas" w:hAnsi="宋体" w:eastAsia="宋体" w:cs="宋体"/>
+              <w:color w:val="252525"/>
+              <w:kern w:val="2"/>
+              <w:sz w:val="21"/>
+              <w:szCs w:val="24"/>
+              <w:shd w:val="clear"/>
+              <w:lang w:val="en-US" w:eastAsia="zh-CN" w:bidi="ar-SA"/>
+            </w:rPr>
+            <w:t>,</w:t>
+          </w:r>
+          <w:r>
+            <w:rPr>
+              <w:rFonts w:hint="eastAsia" w:ascii="Consolas" w:hAnsi="宋体" w:eastAsia="宋体" w:cs="宋体"/>
+              <w:color w:val="C48200"/>
+              <w:kern w:val="2"/>
+              <w:sz w:val="21"/>
+              <w:szCs w:val="24"/>
+              <w:shd w:val="clear"/>
+              <w:lang w:val="en-US" w:eastAsia="zh-CN" w:bidi="ar-SA"/>
+            </w:rPr>
+            <w:t>0xA0</w:t>
+          </w:r>
+          <w:r>
+            <w:rPr>
+              <w:rFonts w:hint="eastAsia" w:ascii="Consolas" w:hAnsi="宋体" w:eastAsia="宋体" w:cs="宋体"/>
+              <w:color w:val="252525"/>
+              <w:kern w:val="2"/>
+              <w:sz w:val="21"/>
+              <w:szCs w:val="24"/>
+              <w:shd w:val="clear"/>
+              <w:lang w:val="en-US" w:eastAsia="zh-CN" w:bidi="ar-SA"/>
+            </w:rPr>
+            <w:t>,</w:t>
+          </w:r>
+          <w:r>
+            <w:rPr>
+              <w:rFonts w:hint="eastAsia" w:ascii="Consolas" w:hAnsi="宋体" w:eastAsia="宋体" w:cs="宋体"/>
+              <w:color w:val="C48200"/>
+              <w:kern w:val="2"/>
+              <w:sz w:val="21"/>
+              <w:szCs w:val="24"/>
+              <w:shd w:val="clear"/>
+              <w:lang w:val="en-US" w:eastAsia="zh-CN" w:bidi="ar-SA"/>
+            </w:rPr>
+            <w:t>0x02</w:t>
+          </w:r>
+          <w:r>
+            <w:rPr>
+              <w:rFonts w:hint="eastAsia" w:ascii="Consolas" w:hAnsi="宋体" w:eastAsia="宋体" w:cs="宋体"/>
+              <w:color w:val="252525"/>
+              <w:kern w:val="2"/>
+              <w:sz w:val="21"/>
+              <w:szCs w:val="24"/>
+              <w:shd w:val="clear"/>
+              <w:lang w:val="en-US" w:eastAsia="zh-CN" w:bidi="ar-SA"/>
+            </w:rPr>
+            <w:t>,</w:t>
+          </w:r>
+          <w:r>
+            <w:rPr>
+              <w:rFonts w:hint="eastAsia" w:ascii="Consolas" w:hAnsi="宋体" w:eastAsia="宋体" w:cs="宋体"/>
+              <w:color w:val="BB2726"/>
+              <w:kern w:val="2"/>
+              <w:sz w:val="21"/>
+              <w:szCs w:val="24"/>
+              <w:shd w:val="clear"/>
+              <w:lang w:val="en-US" w:eastAsia="zh-CN" w:bidi="ar-SA"/>
+            </w:rPr>
+            <w:t>I2C_REG_SIZE_8BIT</w:t>
+          </w:r>
+          <w:r>
+            <w:rPr>
+              <w:rFonts w:hint="eastAsia" w:ascii="Consolas" w:hAnsi="宋体" w:eastAsia="宋体" w:cs="宋体"/>
+              <w:color w:val="252525"/>
+              <w:kern w:val="2"/>
+              <w:sz w:val="21"/>
+              <w:szCs w:val="24"/>
+              <w:shd w:val="clear"/>
+              <w:lang w:val="en-US" w:eastAsia="zh-CN" w:bidi="ar-SA"/>
+            </w:rPr>
+            <w:t>,</w:t>
+          </w:r>
+          <w:r>
+            <w:rPr>
+              <w:rFonts w:hint="eastAsia" w:ascii="Consolas" w:hAnsi="宋体" w:eastAsia="宋体" w:cs="宋体"/>
+              <w:color w:val="BB2726"/>
+              <w:kern w:val="2"/>
+              <w:sz w:val="21"/>
+              <w:szCs w:val="24"/>
+              <w:shd w:val="clear"/>
+              <w:lang w:val="en-US" w:eastAsia="zh-CN" w:bidi="ar-SA"/>
+            </w:rPr>
+            <w:t>wBuf</w:t>
+          </w:r>
+          <w:r>
+            <w:rPr>
+              <w:rFonts w:hint="eastAsia" w:ascii="Consolas" w:hAnsi="宋体" w:eastAsia="宋体" w:cs="宋体"/>
+              <w:color w:val="252525"/>
+              <w:kern w:val="2"/>
+              <w:sz w:val="21"/>
+              <w:szCs w:val="24"/>
+              <w:shd w:val="clear"/>
+              <w:lang w:val="en-US" w:eastAsia="zh-CN" w:bidi="ar-SA"/>
+            </w:rPr>
+            <w:t>,</w:t>
+          </w:r>
+          <w:r>
+            <w:rPr>
+              <w:rFonts w:hint="eastAsia" w:ascii="Consolas" w:hAnsi="宋体" w:eastAsia="宋体" w:cs="宋体"/>
+              <w:color w:val="C48200"/>
+              <w:kern w:val="2"/>
+              <w:sz w:val="21"/>
+              <w:szCs w:val="24"/>
+              <w:shd w:val="clear"/>
+              <w:lang w:val="en-US" w:eastAsia="zh-CN" w:bidi="ar-SA"/>
+            </w:rPr>
+            <w:t>2</w:t>
+          </w:r>
+          <w:r>
+            <w:rPr>
+              <w:rFonts w:hint="eastAsia" w:ascii="Consolas" w:hAnsi="宋体" w:eastAsia="宋体" w:cs="宋体"/>
+              <w:color w:val="252525"/>
+              <w:kern w:val="2"/>
+              <w:sz w:val="21"/>
+              <w:szCs w:val="24"/>
+              <w:shd w:val="clear"/>
+              <w:lang w:val="en-US" w:eastAsia="zh-CN" w:bidi="ar-SA"/>
+            </w:rPr>
+            <w:t>,</w:t>
+          </w:r>
+          <w:r>
+            <w:rPr>
+              <w:rFonts w:hint="eastAsia" w:ascii="Consolas" w:hAnsi="宋体" w:eastAsia="宋体" w:cs="宋体"/>
+              <w:color w:val="C48200"/>
+              <w:kern w:val="2"/>
+              <w:sz w:val="21"/>
+              <w:szCs w:val="24"/>
+              <w:shd w:val="clear"/>
+              <w:lang w:val="en-US" w:eastAsia="zh-CN" w:bidi="ar-SA"/>
+            </w:rPr>
+            <w:t>100</w:t>
+          </w:r>
+          <w:r>
+            <w:rPr>
+              <w:rFonts w:hint="eastAsia" w:ascii="Consolas" w:hAnsi="宋体" w:eastAsia="宋体" w:cs="宋体"/>
+              <w:color w:val="252525"/>
+              <w:kern w:val="2"/>
+              <w:sz w:val="21"/>
+              <w:szCs w:val="24"/>
+              <w:shd w:val="clear"/>
+              <w:lang w:val="en-US" w:eastAsia="zh-CN" w:bidi="ar-SA"/>
+            </w:rPr>
+            <w:t>)</w:t>
+          </w:r>
+        </w:p>
+      </w:sdtContent>
+    </w:sdt>
+    <w:p>
+      <w:pPr>
+        <w:pStyle w:val="3"/>
+        <w:keepNext w:val="0"/>
+        <w:keepLines w:val="0"/>
+        <w:widowControl/>
+        <w:suppressLineNumbers w:val="0"/>
+      </w:pPr>
+      <w:r>
+        <w:t>HAL_I2C_Mem_Read()</w:t>
+      </w:r>
+    </w:p>
+    <w:p>
+      <w:pPr>
+        <w:rPr>
+          <w:rFonts w:hint="eastAsia" w:ascii="宋体" w:hAnsi="宋体" w:cs="宋体"/>
+          <w:sz w:val="24"/>
+          <w:szCs w:val="24"/>
+          <w:lang w:eastAsia="zh-CN"/>
+        </w:rPr>
+      </w:pPr>
+      <w:r>
+        <w:rPr>
+          <w:rFonts w:ascii="宋体" w:hAnsi="宋体" w:eastAsia="宋体" w:cs="宋体"/>
+          <w:sz w:val="24"/>
+          <w:szCs w:val="24"/>
+        </w:rPr>
+        <w:t>功能：I2C 读取从机指定寄存器的数据</w:t>
+      </w:r>
+      <w:r>
+        <w:rPr>
+          <w:rFonts w:hint="eastAsia" w:ascii="宋体" w:hAnsi="宋体" w:cs="宋体"/>
+          <w:sz w:val="24"/>
+          <w:szCs w:val="24"/>
+          <w:lang w:eastAsia="zh-CN"/>
+        </w:rPr>
+        <w:t>。</w:t>
+      </w:r>
+    </w:p>
+    <w:p>
+      <w:pPr>
+        <w:rPr>
+          <w:rFonts w:hint="eastAsia" w:ascii="宋体" w:hAnsi="宋体" w:eastAsia="宋体" w:cs="宋体"/>
+          <w:sz w:val="24"/>
+          <w:szCs w:val="24"/>
+          <w:lang w:eastAsia="zh-CN"/>
+        </w:rPr>
+      </w:pPr>
+      <w:r>
+        <w:rPr>
+          <w:rFonts w:ascii="宋体" w:hAnsi="宋体" w:eastAsia="宋体" w:cs="宋体"/>
+          <w:sz w:val="24"/>
+          <w:szCs w:val="24"/>
+        </w:rPr>
+        <w:t>参数：I2C 句柄指针、从机地址、从机寄存器地址、寄存器地址长度、接收缓冲区指针、读取字节数、超时时间</w:t>
+      </w:r>
+      <w:r>
+        <w:rPr>
+          <w:rFonts w:hint="eastAsia" w:ascii="宋体" w:hAnsi="宋体" w:cs="宋体"/>
+          <w:sz w:val="24"/>
+          <w:szCs w:val="24"/>
+          <w:lang w:eastAsia="zh-CN"/>
+        </w:rPr>
+        <w:t>。</w:t>
+      </w:r>
+    </w:p>
+    <w:p>
+      <w:pPr>
+        <w:rPr>
+          <w:rFonts w:hint="eastAsia" w:ascii="宋体" w:hAnsi="宋体" w:eastAsia="宋体" w:cs="宋体"/>
+          <w:sz w:val="24"/>
+          <w:szCs w:val="24"/>
+          <w:lang w:eastAsia="zh-CN"/>
+        </w:rPr>
+      </w:pPr>
+      <w:r>
+        <w:rPr>
+          <w:rFonts w:ascii="宋体" w:hAnsi="宋体" w:eastAsia="宋体" w:cs="宋体"/>
+          <w:sz w:val="24"/>
+          <w:szCs w:val="24"/>
+        </w:rPr>
+        <w:t>返回值：HAL 状态</w:t>
+      </w:r>
+      <w:r>
+        <w:rPr>
+          <w:rFonts w:hint="eastAsia" w:ascii="宋体" w:hAnsi="宋体" w:cs="宋体"/>
+          <w:sz w:val="24"/>
+          <w:szCs w:val="24"/>
+          <w:lang w:eastAsia="zh-CN"/>
+        </w:rPr>
+        <w:t>。</w:t>
+      </w:r>
+    </w:p>
+    <w:sdt>
+      <w:sdtPr>
+        <w:rPr>
+          <w:rFonts w:hint="default" w:ascii="Consolas" w:hAnsi="宋体" w:eastAsia="宋体" w:cs="宋体"/>
+          <w:color w:val="252525"/>
+          <w:kern w:val="2"/>
+          <w:sz w:val="21"/>
+          <w:szCs w:val="24"/>
+          <w:shd w:val="clear"/>
+          <w:lang w:val="en-US" w:eastAsia="zh-CN" w:bidi="ar-SA"/>
+        </w:rPr>
+        <w:id w:val="147456349"/>
+        <w:placeholder>
+          <w:docPart w:val="{779f9e51-5de6-4c8f-a2b5-51b7aadd9d60}"/>
+        </w:placeholder>
+        <w15:appearance w15:val="hidden"/>
+      </w:sdtPr>
+      <w:sdtEndPr>
+        <w:rPr>
+          <w:rFonts w:hint="default" w:ascii="Consolas" w:eastAsia="宋体" w:hAnsiTheme="minorAscii" w:cstheme="minorBidi"/>
+          <w:kern w:val="0"/>
+          <w:sz w:val="21"/>
+          <w:szCs w:val="24"/>
+          <w:shd w:val="clear"/>
+          <w:lang w:val="en-US" w:eastAsia="zh-CN" w:bidi="ar"/>
+        </w:rPr>
+      </w:sdtEndPr>
+      <w:sdtContent>
+        <w:p>
+          <w:pPr>
+            <w:shd w:val="clear" w:fill="F5F5F5"/>
+            <w:ind w:left="480" w:leftChars="200"/>
+            <w:rPr>
+              <w:rFonts w:hint="default" w:ascii="Consolas" w:hAnsi="宋体" w:eastAsia="宋体" w:cs="宋体"/>
+              <w:color w:val="252525"/>
+              <w:kern w:val="2"/>
+              <w:sz w:val="21"/>
+              <w:szCs w:val="24"/>
+              <w:shd w:val="clear"/>
+              <w:lang w:val="en-US" w:eastAsia="zh-CN" w:bidi="ar-SA"/>
+            </w:rPr>
+          </w:pPr>
+          <w:r>
+            <w:rPr>
+              <w:rFonts w:hint="default" w:ascii="Consolas" w:hAnsi="宋体" w:eastAsia="宋体" w:cs="宋体"/>
+              <w:color w:val="1E5FC7"/>
+              <w:kern w:val="2"/>
+              <w:sz w:val="21"/>
+              <w:szCs w:val="24"/>
+              <w:shd w:val="clear"/>
+              <w:lang w:val="en-US" w:eastAsia="zh-CN" w:bidi="ar-SA"/>
+            </w:rPr>
+            <w:t>uint8_t</w:t>
+          </w:r>
+          <w:r>
+            <w:rPr>
+              <w:rFonts w:hint="default" w:ascii="Consolas" w:hAnsi="宋体" w:eastAsia="宋体" w:cs="宋体"/>
+              <w:color w:val="252525"/>
+              <w:kern w:val="2"/>
+              <w:sz w:val="21"/>
+              <w:szCs w:val="24"/>
+              <w:shd w:val="clear"/>
+              <w:lang w:val="en-US" w:eastAsia="zh-CN" w:bidi="ar-SA"/>
+            </w:rPr>
+            <w:t xml:space="preserve"> </w:t>
+          </w:r>
+          <w:r>
+            <w:rPr>
+              <w:rFonts w:hint="default" w:ascii="Consolas" w:hAnsi="宋体" w:eastAsia="宋体" w:cs="宋体"/>
+              <w:color w:val="BB2726"/>
+              <w:kern w:val="2"/>
+              <w:sz w:val="21"/>
+              <w:szCs w:val="24"/>
+              <w:shd w:val="clear"/>
+              <w:lang w:val="en-US" w:eastAsia="zh-CN" w:bidi="ar-SA"/>
+            </w:rPr>
+            <w:t>rBuf</w:t>
+          </w:r>
+          <w:r>
+            <w:rPr>
+              <w:rFonts w:hint="default" w:ascii="Consolas" w:hAnsi="宋体" w:eastAsia="宋体" w:cs="宋体"/>
+              <w:color w:val="252525"/>
+              <w:kern w:val="2"/>
+              <w:sz w:val="21"/>
+              <w:szCs w:val="24"/>
+              <w:shd w:val="clear"/>
+              <w:lang w:val="en-US" w:eastAsia="zh-CN" w:bidi="ar-SA"/>
+            </w:rPr>
+            <w:t>[</w:t>
+          </w:r>
+          <w:r>
+            <w:rPr>
+              <w:rFonts w:hint="default" w:ascii="Consolas" w:hAnsi="宋体" w:eastAsia="宋体" w:cs="宋体"/>
+              <w:color w:val="C48200"/>
+              <w:kern w:val="2"/>
+              <w:sz w:val="21"/>
+              <w:szCs w:val="24"/>
+              <w:shd w:val="clear"/>
+              <w:lang w:val="en-US" w:eastAsia="zh-CN" w:bidi="ar-SA"/>
+            </w:rPr>
+            <w:t>2</w:t>
+          </w:r>
+          <w:r>
+            <w:rPr>
+              <w:rFonts w:hint="default" w:ascii="Consolas" w:hAnsi="宋体" w:eastAsia="宋体" w:cs="宋体"/>
+              <w:color w:val="252525"/>
+              <w:kern w:val="2"/>
+              <w:sz w:val="21"/>
+              <w:szCs w:val="24"/>
+              <w:shd w:val="clear"/>
+              <w:lang w:val="en-US" w:eastAsia="zh-CN" w:bidi="ar-SA"/>
+            </w:rPr>
+            <w:t>];</w:t>
+          </w:r>
+        </w:p>
+        <w:p>
+          <w:pPr>
+            <w:shd w:val="clear" w:fill="F5F5F5"/>
+            <w:ind w:left="480" w:leftChars="200"/>
+            <w:rPr>
+              <w:rFonts w:hint="default" w:ascii="Consolas" w:hAnsi="宋体" w:eastAsia="宋体" w:cs="宋体"/>
+              <w:color w:val="252525"/>
+              <w:kern w:val="2"/>
+              <w:sz w:val="21"/>
+              <w:szCs w:val="24"/>
+              <w:shd w:val="clear"/>
+              <w:lang w:val="en-US" w:eastAsia="zh-CN" w:bidi="ar-SA"/>
+            </w:rPr>
+          </w:pPr>
+          <w:r>
+            <w:rPr>
+              <w:rFonts w:hint="default" w:ascii="Consolas" w:hAnsi="宋体" w:eastAsia="宋体" w:cs="宋体"/>
+              <w:color w:val="909090"/>
+              <w:kern w:val="2"/>
+              <w:sz w:val="21"/>
+              <w:szCs w:val="24"/>
+              <w:shd w:val="clear"/>
+              <w:lang w:val="en-US" w:eastAsia="zh-CN" w:bidi="ar-SA"/>
+            </w:rPr>
+            <w:t>//从机地址0xA0，寄存器0x02，寄存器8位，读取2字节，超时100ms</w:t>
+          </w:r>
+        </w:p>
+        <w:p>
+          <w:pPr>
+            <w:shd w:val="clear" w:fill="F5F5F5"/>
+            <w:ind w:left="480" w:leftChars="200"/>
+            <w:rPr>
+              <w:rFonts w:hint="default" w:ascii="Consolas"/>
+              <w:sz w:val="21"/>
+              <w:shd w:val="clear"/>
+              <w:lang w:val="en-US" w:eastAsia="zh-CN"/>
+            </w:rPr>
+          </w:pPr>
+          <w:r>
+            <w:rPr>
+              <w:rFonts w:hint="default" w:ascii="Consolas" w:hAnsi="宋体" w:eastAsia="宋体" w:cs="宋体"/>
+              <w:color w:val="BB2726"/>
+              <w:kern w:val="2"/>
+              <w:sz w:val="21"/>
+              <w:szCs w:val="24"/>
+              <w:shd w:val="clear"/>
+              <w:lang w:val="en-US" w:eastAsia="zh-CN" w:bidi="ar-SA"/>
+            </w:rPr>
+            <w:t>HAL_I2C_Mem_Read</w:t>
+          </w:r>
+          <w:r>
+            <w:rPr>
+              <w:rFonts w:hint="default" w:ascii="Consolas" w:hAnsi="宋体" w:eastAsia="宋体" w:cs="宋体"/>
+              <w:color w:val="252525"/>
+              <w:kern w:val="2"/>
+              <w:sz w:val="21"/>
+              <w:szCs w:val="24"/>
+              <w:shd w:val="clear"/>
+              <w:lang w:val="en-US" w:eastAsia="zh-CN" w:bidi="ar-SA"/>
+            </w:rPr>
+            <w:t>(&amp;</w:t>
+          </w:r>
+          <w:r>
+            <w:rPr>
+              <w:rFonts w:hint="default" w:ascii="Consolas" w:hAnsi="宋体" w:eastAsia="宋体" w:cs="宋体"/>
+              <w:color w:val="BB2726"/>
+              <w:kern w:val="2"/>
+              <w:sz w:val="21"/>
+              <w:szCs w:val="24"/>
+              <w:shd w:val="clear"/>
+              <w:lang w:val="en-US" w:eastAsia="zh-CN" w:bidi="ar-SA"/>
+            </w:rPr>
+            <w:t>hi2c1</w:t>
+          </w:r>
+          <w:r>
+            <w:rPr>
+              <w:rFonts w:hint="default" w:ascii="Consolas" w:hAnsi="宋体" w:eastAsia="宋体" w:cs="宋体"/>
+              <w:color w:val="252525"/>
+              <w:kern w:val="2"/>
+              <w:sz w:val="21"/>
+              <w:szCs w:val="24"/>
+              <w:shd w:val="clear"/>
+              <w:lang w:val="en-US" w:eastAsia="zh-CN" w:bidi="ar-SA"/>
+            </w:rPr>
+            <w:t>,</w:t>
+          </w:r>
+          <w:r>
+            <w:rPr>
+              <w:rFonts w:hint="default" w:ascii="Consolas" w:hAnsi="宋体" w:eastAsia="宋体" w:cs="宋体"/>
+              <w:color w:val="C48200"/>
+              <w:kern w:val="2"/>
+              <w:sz w:val="21"/>
+              <w:szCs w:val="24"/>
+              <w:shd w:val="clear"/>
+              <w:lang w:val="en-US" w:eastAsia="zh-CN" w:bidi="ar-SA"/>
+            </w:rPr>
+            <w:t>0xA0</w:t>
+          </w:r>
+          <w:r>
+            <w:rPr>
+              <w:rFonts w:hint="default" w:ascii="Consolas" w:hAnsi="宋体" w:eastAsia="宋体" w:cs="宋体"/>
+              <w:color w:val="252525"/>
+              <w:kern w:val="2"/>
+              <w:sz w:val="21"/>
+              <w:szCs w:val="24"/>
+              <w:shd w:val="clear"/>
+              <w:lang w:val="en-US" w:eastAsia="zh-CN" w:bidi="ar-SA"/>
+            </w:rPr>
+            <w:t>,</w:t>
+          </w:r>
+          <w:r>
+            <w:rPr>
+              <w:rFonts w:hint="default" w:ascii="Consolas" w:hAnsi="宋体" w:eastAsia="宋体" w:cs="宋体"/>
+              <w:color w:val="C48200"/>
+              <w:kern w:val="2"/>
+              <w:sz w:val="21"/>
+              <w:szCs w:val="24"/>
+              <w:shd w:val="clear"/>
+              <w:lang w:val="en-US" w:eastAsia="zh-CN" w:bidi="ar-SA"/>
+            </w:rPr>
+            <w:t>0x02</w:t>
+          </w:r>
+          <w:r>
+            <w:rPr>
+              <w:rFonts w:hint="default" w:ascii="Consolas" w:hAnsi="宋体" w:eastAsia="宋体" w:cs="宋体"/>
+              <w:color w:val="252525"/>
+              <w:kern w:val="2"/>
+              <w:sz w:val="21"/>
+              <w:szCs w:val="24"/>
+              <w:shd w:val="clear"/>
+              <w:lang w:val="en-US" w:eastAsia="zh-CN" w:bidi="ar-SA"/>
+            </w:rPr>
+            <w:t>,</w:t>
+          </w:r>
+          <w:r>
+            <w:rPr>
+              <w:rFonts w:hint="default" w:ascii="Consolas" w:hAnsi="宋体" w:eastAsia="宋体" w:cs="宋体"/>
+              <w:color w:val="BB2726"/>
+              <w:kern w:val="2"/>
+              <w:sz w:val="21"/>
+              <w:szCs w:val="24"/>
+              <w:shd w:val="clear"/>
+              <w:lang w:val="en-US" w:eastAsia="zh-CN" w:bidi="ar-SA"/>
+            </w:rPr>
+            <w:t>I2C_REG_SIZE_8BIT</w:t>
+          </w:r>
+          <w:r>
+            <w:rPr>
+              <w:rFonts w:hint="default" w:ascii="Consolas" w:hAnsi="宋体" w:eastAsia="宋体" w:cs="宋体"/>
+              <w:color w:val="252525"/>
+              <w:kern w:val="2"/>
+              <w:sz w:val="21"/>
+              <w:szCs w:val="24"/>
+              <w:shd w:val="clear"/>
+              <w:lang w:val="en-US" w:eastAsia="zh-CN" w:bidi="ar-SA"/>
+            </w:rPr>
+            <w:t>,</w:t>
+          </w:r>
+          <w:r>
+            <w:rPr>
+              <w:rFonts w:hint="default" w:ascii="Consolas" w:hAnsi="宋体" w:eastAsia="宋体" w:cs="宋体"/>
+              <w:color w:val="BB2726"/>
+              <w:kern w:val="2"/>
+              <w:sz w:val="21"/>
+              <w:szCs w:val="24"/>
+              <w:shd w:val="clear"/>
+              <w:lang w:val="en-US" w:eastAsia="zh-CN" w:bidi="ar-SA"/>
+            </w:rPr>
+            <w:t>rBuf</w:t>
+          </w:r>
+          <w:r>
+            <w:rPr>
+              <w:rFonts w:hint="default" w:ascii="Consolas" w:hAnsi="宋体" w:eastAsia="宋体" w:cs="宋体"/>
+              <w:color w:val="252525"/>
+              <w:kern w:val="2"/>
+              <w:sz w:val="21"/>
+              <w:szCs w:val="24"/>
+              <w:shd w:val="clear"/>
+              <w:lang w:val="en-US" w:eastAsia="zh-CN" w:bidi="ar-SA"/>
+            </w:rPr>
+            <w:t>,</w:t>
+          </w:r>
+          <w:r>
+            <w:rPr>
+              <w:rFonts w:hint="default" w:ascii="Consolas" w:hAnsi="宋体" w:eastAsia="宋体" w:cs="宋体"/>
+              <w:color w:val="C48200"/>
+              <w:kern w:val="2"/>
+              <w:sz w:val="21"/>
+              <w:szCs w:val="24"/>
+              <w:shd w:val="clear"/>
+              <w:lang w:val="en-US" w:eastAsia="zh-CN" w:bidi="ar-SA"/>
+            </w:rPr>
+            <w:t>2</w:t>
+          </w:r>
+          <w:r>
+            <w:rPr>
+              <w:rFonts w:hint="default" w:ascii="Consolas" w:hAnsi="宋体" w:eastAsia="宋体" w:cs="宋体"/>
+              <w:color w:val="252525"/>
+              <w:kern w:val="2"/>
+              <w:sz w:val="21"/>
+              <w:szCs w:val="24"/>
+              <w:shd w:val="clear"/>
+              <w:lang w:val="en-US" w:eastAsia="zh-CN" w:bidi="ar-SA"/>
+            </w:rPr>
+            <w:t>,</w:t>
+          </w:r>
+          <w:r>
+            <w:rPr>
+              <w:rFonts w:hint="default" w:ascii="Consolas" w:hAnsi="宋体" w:eastAsia="宋体" w:cs="宋体"/>
+              <w:color w:val="C48200"/>
+              <w:kern w:val="2"/>
+              <w:sz w:val="21"/>
+              <w:szCs w:val="24"/>
+              <w:shd w:val="clear"/>
+              <w:lang w:val="en-US" w:eastAsia="zh-CN" w:bidi="ar-SA"/>
+            </w:rPr>
+            <w:t>100</w:t>
+          </w:r>
+          <w:r>
+            <w:rPr>
+              <w:rFonts w:hint="default" w:ascii="Consolas" w:hAnsi="宋体" w:eastAsia="宋体" w:cs="宋体"/>
+              <w:color w:val="252525"/>
+              <w:kern w:val="2"/>
+              <w:sz w:val="21"/>
+              <w:szCs w:val="24"/>
+              <w:shd w:val="clear"/>
+              <w:lang w:val="en-US" w:eastAsia="zh-CN" w:bidi="ar-SA"/>
+            </w:rPr>
+            <w:t>);</w:t>
+          </w:r>
+        </w:p>
+      </w:sdtContent>
+    </w:sdt>
+    <w:p>
+      <w:pPr>
+        <w:pStyle w:val="3"/>
+        <w:keepNext w:val="0"/>
+        <w:keepLines w:val="0"/>
+        <w:widowControl/>
+        <w:suppressLineNumbers w:val="0"/>
+      </w:pPr>
+      <w:r>
+        <w:t>HAL_I2C_Mem_Write_IT()</w:t>
+      </w:r>
+    </w:p>
+    <w:p>
+      <w:pPr>
+        <w:rPr>
+          <w:rFonts w:hint="eastAsia" w:ascii="宋体" w:hAnsi="宋体" w:eastAsia="宋体" w:cs="宋体"/>
+          <w:sz w:val="24"/>
+          <w:szCs w:val="24"/>
+          <w:lang w:eastAsia="zh-CN"/>
+        </w:rPr>
+      </w:pPr>
+      <w:r>
+        <w:rPr>
+          <w:rFonts w:ascii="宋体" w:hAnsi="宋体" w:eastAsia="宋体" w:cs="宋体"/>
+          <w:sz w:val="24"/>
+          <w:szCs w:val="24"/>
+        </w:rPr>
+        <w:t>功能：中断模式，I2C 向从机指定寄存器写入数据</w:t>
+      </w:r>
+      <w:r>
+        <w:rPr>
+          <w:rFonts w:hint="eastAsia" w:ascii="宋体" w:hAnsi="宋体" w:cs="宋体"/>
+          <w:sz w:val="24"/>
+          <w:szCs w:val="24"/>
+          <w:lang w:eastAsia="zh-CN"/>
+        </w:rPr>
+        <w:t>。</w:t>
+      </w:r>
+    </w:p>
+    <w:p>
+      <w:pPr>
+        <w:rPr>
+          <w:rFonts w:hint="eastAsia" w:ascii="宋体" w:hAnsi="宋体" w:eastAsia="宋体" w:cs="宋体"/>
+          <w:sz w:val="24"/>
+          <w:szCs w:val="24"/>
+          <w:lang w:eastAsia="zh-CN"/>
+        </w:rPr>
+      </w:pPr>
+      <w:r>
+        <w:rPr>
+          <w:rFonts w:ascii="宋体" w:hAnsi="宋体" w:eastAsia="宋体" w:cs="宋体"/>
+          <w:sz w:val="24"/>
+          <w:szCs w:val="24"/>
+        </w:rPr>
+        <w:t>参数：I2C 句柄指针、从机地址、从机寄存器地址、寄存器地址长度、数据缓冲区指针、写入字节数</w:t>
+      </w:r>
+      <w:r>
+        <w:rPr>
+          <w:rFonts w:hint="eastAsia" w:ascii="宋体" w:hAnsi="宋体" w:cs="宋体"/>
+          <w:sz w:val="24"/>
+          <w:szCs w:val="24"/>
+          <w:lang w:eastAsia="zh-CN"/>
+        </w:rPr>
+        <w:t>。</w:t>
+      </w:r>
+    </w:p>
+    <w:p>
+      <w:pPr>
+        <w:rPr>
+          <w:rFonts w:hint="eastAsia" w:ascii="宋体" w:hAnsi="宋体" w:cs="宋体"/>
+          <w:sz w:val="24"/>
+          <w:szCs w:val="24"/>
+          <w:lang w:eastAsia="zh-CN"/>
+        </w:rPr>
+      </w:pPr>
+      <w:r>
+        <w:rPr>
+          <w:rFonts w:ascii="宋体" w:hAnsi="宋体" w:eastAsia="宋体" w:cs="宋体"/>
+          <w:sz w:val="24"/>
+          <w:szCs w:val="24"/>
+        </w:rPr>
+        <w:t>返回值：HAL 状态</w:t>
+      </w:r>
+      <w:r>
+        <w:rPr>
+          <w:rFonts w:hint="eastAsia" w:ascii="宋体" w:hAnsi="宋体" w:cs="宋体"/>
+          <w:sz w:val="24"/>
+          <w:szCs w:val="24"/>
+          <w:lang w:eastAsia="zh-CN"/>
+        </w:rPr>
+        <w:t>。</w:t>
+      </w:r>
+    </w:p>
+    <w:sdt>
+      <w:sdtPr>
+        <w:rPr>
+          <w:rFonts w:hint="eastAsia" w:ascii="Consolas" w:hAnsi="宋体" w:eastAsia="宋体" w:cs="宋体"/>
+          <w:kern w:val="2"/>
+          <w:sz w:val="21"/>
+          <w:szCs w:val="24"/>
+          <w:shd w:val="clear"/>
+          <w:lang w:val="en-US" w:eastAsia="zh-CN" w:bidi="ar-SA"/>
+        </w:rPr>
+        <w:id w:val="147455928"/>
+        <w:placeholder>
+          <w:docPart w:val="{0bd8458a-c69b-4441-b41b-00058291b7f5}"/>
+        </w:placeholder>
+        <w15:appearance w15:val="hidden"/>
+      </w:sdtPr>
+      <w:sdtEndPr>
+        <w:rPr>
+          <w:rFonts w:hint="eastAsia" w:ascii="Consolas" w:hAnsi="宋体" w:eastAsia="宋体" w:cs="宋体"/>
+          <w:kern w:val="2"/>
+          <w:sz w:val="21"/>
+          <w:szCs w:val="24"/>
+          <w:shd w:val="clear"/>
+          <w:lang w:val="en-US" w:eastAsia="zh-CN" w:bidi="ar-SA"/>
+        </w:rPr>
+      </w:sdtEndPr>
+      <w:sdtContent>
+        <w:p>
+          <w:pPr>
+            <w:shd w:val="clear" w:fill="F5F5F5"/>
+            <w:ind w:left="480" w:leftChars="200"/>
+            <w:rPr>
+              <w:rFonts w:hint="eastAsia" w:ascii="Consolas" w:hAnsi="宋体" w:eastAsia="宋体" w:cs="宋体"/>
+              <w:color w:val="252525"/>
+              <w:kern w:val="2"/>
+              <w:sz w:val="21"/>
+              <w:szCs w:val="24"/>
+              <w:shd w:val="clear"/>
+              <w:lang w:val="en-US" w:eastAsia="zh-CN" w:bidi="ar-SA"/>
+            </w:rPr>
+          </w:pPr>
+          <w:r>
+            <w:rPr>
+              <w:rFonts w:hint="eastAsia" w:ascii="Consolas" w:hAnsi="宋体" w:eastAsia="宋体" w:cs="宋体"/>
+              <w:color w:val="1E5FC7"/>
+              <w:kern w:val="2"/>
+              <w:sz w:val="21"/>
+              <w:szCs w:val="24"/>
+              <w:shd w:val="clear"/>
+              <w:lang w:val="en-US" w:eastAsia="zh-CN" w:bidi="ar-SA"/>
+            </w:rPr>
+            <w:t>uint8_t</w:t>
+          </w:r>
+          <w:r>
+            <w:rPr>
+              <w:rFonts w:hint="eastAsia" w:ascii="Consolas" w:hAnsi="宋体" w:eastAsia="宋体" w:cs="宋体"/>
+              <w:color w:val="252525"/>
+              <w:kern w:val="2"/>
+              <w:sz w:val="21"/>
+              <w:szCs w:val="24"/>
+              <w:shd w:val="clear"/>
+              <w:lang w:val="en-US" w:eastAsia="zh-CN" w:bidi="ar-SA"/>
+            </w:rPr>
+            <w:t xml:space="preserve"> </w:t>
+          </w:r>
+          <w:r>
+            <w:rPr>
+              <w:rFonts w:hint="eastAsia" w:ascii="Consolas" w:hAnsi="宋体" w:eastAsia="宋体" w:cs="宋体"/>
+              <w:color w:val="BB2726"/>
+              <w:kern w:val="2"/>
+              <w:sz w:val="21"/>
+              <w:szCs w:val="24"/>
+              <w:shd w:val="clear"/>
+              <w:lang w:val="en-US" w:eastAsia="zh-CN" w:bidi="ar-SA"/>
+            </w:rPr>
+            <w:t>wBuf</w:t>
+          </w:r>
+          <w:r>
+            <w:rPr>
+              <w:rFonts w:hint="eastAsia" w:ascii="Consolas" w:hAnsi="宋体" w:eastAsia="宋体" w:cs="宋体"/>
+              <w:color w:val="252525"/>
+              <w:kern w:val="2"/>
+              <w:sz w:val="21"/>
+              <w:szCs w:val="24"/>
+              <w:shd w:val="clear"/>
+              <w:lang w:val="en-US" w:eastAsia="zh-CN" w:bidi="ar-SA"/>
+            </w:rPr>
+            <w:t>[</w:t>
+          </w:r>
+          <w:r>
+            <w:rPr>
+              <w:rFonts w:hint="eastAsia" w:ascii="Consolas" w:hAnsi="宋体" w:eastAsia="宋体" w:cs="宋体"/>
+              <w:color w:val="C48200"/>
+              <w:kern w:val="2"/>
+              <w:sz w:val="21"/>
+              <w:szCs w:val="24"/>
+              <w:shd w:val="clear"/>
+              <w:lang w:val="en-US" w:eastAsia="zh-CN" w:bidi="ar-SA"/>
+            </w:rPr>
+            <w:t>2</w:t>
+          </w:r>
+          <w:r>
+            <w:rPr>
+              <w:rFonts w:hint="eastAsia" w:ascii="Consolas" w:hAnsi="宋体" w:eastAsia="宋体" w:cs="宋体"/>
+              <w:color w:val="252525"/>
+              <w:kern w:val="2"/>
+              <w:sz w:val="21"/>
+              <w:szCs w:val="24"/>
+              <w:shd w:val="clear"/>
+              <w:lang w:val="en-US" w:eastAsia="zh-CN" w:bidi="ar-SA"/>
+            </w:rPr>
+            <w:t>] = {</w:t>
+          </w:r>
+          <w:r>
+            <w:rPr>
+              <w:rFonts w:hint="eastAsia" w:ascii="Consolas" w:hAnsi="宋体" w:eastAsia="宋体" w:cs="宋体"/>
+              <w:color w:val="C48200"/>
+              <w:kern w:val="2"/>
+              <w:sz w:val="21"/>
+              <w:szCs w:val="24"/>
+              <w:shd w:val="clear"/>
+              <w:lang w:val="en-US" w:eastAsia="zh-CN" w:bidi="ar-SA"/>
+            </w:rPr>
+            <w:t>0x33</w:t>
+          </w:r>
+          <w:r>
+            <w:rPr>
+              <w:rFonts w:hint="eastAsia" w:ascii="Consolas" w:hAnsi="宋体" w:eastAsia="宋体" w:cs="宋体"/>
+              <w:color w:val="252525"/>
+              <w:kern w:val="2"/>
+              <w:sz w:val="21"/>
+              <w:szCs w:val="24"/>
+              <w:shd w:val="clear"/>
+              <w:lang w:val="en-US" w:eastAsia="zh-CN" w:bidi="ar-SA"/>
+            </w:rPr>
+            <w:t>,</w:t>
+          </w:r>
+          <w:r>
+            <w:rPr>
+              <w:rFonts w:hint="eastAsia" w:ascii="Consolas" w:hAnsi="宋体" w:eastAsia="宋体" w:cs="宋体"/>
+              <w:color w:val="C48200"/>
+              <w:kern w:val="2"/>
+              <w:sz w:val="21"/>
+              <w:szCs w:val="24"/>
+              <w:shd w:val="clear"/>
+              <w:lang w:val="en-US" w:eastAsia="zh-CN" w:bidi="ar-SA"/>
+            </w:rPr>
+            <w:t>0x44</w:t>
+          </w:r>
+          <w:r>
+            <w:rPr>
+              <w:rFonts w:hint="eastAsia" w:ascii="Consolas" w:hAnsi="宋体" w:eastAsia="宋体" w:cs="宋体"/>
+              <w:color w:val="252525"/>
+              <w:kern w:val="2"/>
+              <w:sz w:val="21"/>
+              <w:szCs w:val="24"/>
+              <w:shd w:val="clear"/>
+              <w:lang w:val="en-US" w:eastAsia="zh-CN" w:bidi="ar-SA"/>
+            </w:rPr>
+            <w:t>};</w:t>
+          </w:r>
+        </w:p>
+        <w:p>
+          <w:pPr>
+            <w:shd w:val="clear" w:fill="F5F5F5"/>
+            <w:ind w:left="480" w:leftChars="200"/>
+            <w:rPr>
+              <w:rFonts w:hint="eastAsia" w:ascii="Consolas" w:hAnsi="宋体" w:eastAsia="宋体" w:cs="宋体"/>
+              <w:color w:val="252525"/>
+              <w:kern w:val="2"/>
+              <w:sz w:val="21"/>
+              <w:szCs w:val="24"/>
+              <w:shd w:val="clear"/>
+              <w:lang w:val="en-US" w:eastAsia="zh-CN" w:bidi="ar-SA"/>
+            </w:rPr>
+          </w:pPr>
+          <w:r>
+            <w:rPr>
+              <w:rFonts w:hint="eastAsia" w:ascii="Consolas" w:hAnsi="宋体" w:eastAsia="宋体" w:cs="宋体"/>
+              <w:color w:val="BB2726"/>
+              <w:kern w:val="2"/>
+              <w:sz w:val="21"/>
+              <w:szCs w:val="24"/>
+              <w:shd w:val="clear"/>
+              <w:lang w:val="en-US" w:eastAsia="zh-CN" w:bidi="ar-SA"/>
+            </w:rPr>
+            <w:t>HAL_I2C_Mem_Write_IT</w:t>
+          </w:r>
+          <w:r>
+            <w:rPr>
+              <w:rFonts w:hint="eastAsia" w:ascii="Consolas" w:hAnsi="宋体" w:eastAsia="宋体" w:cs="宋体"/>
+              <w:color w:val="252525"/>
+              <w:kern w:val="2"/>
+              <w:sz w:val="21"/>
+              <w:szCs w:val="24"/>
+              <w:shd w:val="clear"/>
+              <w:lang w:val="en-US" w:eastAsia="zh-CN" w:bidi="ar-SA"/>
+            </w:rPr>
+            <w:t>(&amp;</w:t>
+          </w:r>
+          <w:r>
+            <w:rPr>
+              <w:rFonts w:hint="eastAsia" w:ascii="Consolas" w:hAnsi="宋体" w:eastAsia="宋体" w:cs="宋体"/>
+              <w:color w:val="BB2726"/>
+              <w:kern w:val="2"/>
+              <w:sz w:val="21"/>
+              <w:szCs w:val="24"/>
+              <w:shd w:val="clear"/>
+              <w:lang w:val="en-US" w:eastAsia="zh-CN" w:bidi="ar-SA"/>
+            </w:rPr>
+            <w:t>hi2c1</w:t>
+          </w:r>
+          <w:r>
+            <w:rPr>
+              <w:rFonts w:hint="eastAsia" w:ascii="Consolas" w:hAnsi="宋体" w:eastAsia="宋体" w:cs="宋体"/>
+              <w:color w:val="252525"/>
+              <w:kern w:val="2"/>
+              <w:sz w:val="21"/>
+              <w:szCs w:val="24"/>
+              <w:shd w:val="clear"/>
+              <w:lang w:val="en-US" w:eastAsia="zh-CN" w:bidi="ar-SA"/>
+            </w:rPr>
+            <w:t>,</w:t>
+          </w:r>
+          <w:r>
+            <w:rPr>
+              <w:rFonts w:hint="eastAsia" w:ascii="Consolas" w:hAnsi="宋体" w:eastAsia="宋体" w:cs="宋体"/>
+              <w:color w:val="C48200"/>
+              <w:kern w:val="2"/>
+              <w:sz w:val="21"/>
+              <w:szCs w:val="24"/>
+              <w:shd w:val="clear"/>
+              <w:lang w:val="en-US" w:eastAsia="zh-CN" w:bidi="ar-SA"/>
+            </w:rPr>
+            <w:t>0xA0</w:t>
+          </w:r>
+          <w:r>
+            <w:rPr>
+              <w:rFonts w:hint="eastAsia" w:ascii="Consolas" w:hAnsi="宋体" w:eastAsia="宋体" w:cs="宋体"/>
+              <w:color w:val="252525"/>
+              <w:kern w:val="2"/>
+              <w:sz w:val="21"/>
+              <w:szCs w:val="24"/>
+              <w:shd w:val="clear"/>
+              <w:lang w:val="en-US" w:eastAsia="zh-CN" w:bidi="ar-SA"/>
+            </w:rPr>
+            <w:t>,</w:t>
+          </w:r>
+          <w:r>
+            <w:rPr>
+              <w:rFonts w:hint="eastAsia" w:ascii="Consolas" w:hAnsi="宋体" w:eastAsia="宋体" w:cs="宋体"/>
+              <w:color w:val="C48200"/>
+              <w:kern w:val="2"/>
+              <w:sz w:val="21"/>
+              <w:szCs w:val="24"/>
+              <w:shd w:val="clear"/>
+              <w:lang w:val="en-US" w:eastAsia="zh-CN" w:bidi="ar-SA"/>
+            </w:rPr>
+            <w:t>0x02</w:t>
+          </w:r>
+          <w:r>
+            <w:rPr>
+              <w:rFonts w:hint="eastAsia" w:ascii="Consolas" w:hAnsi="宋体" w:eastAsia="宋体" w:cs="宋体"/>
+              <w:color w:val="252525"/>
+              <w:kern w:val="2"/>
+              <w:sz w:val="21"/>
+              <w:szCs w:val="24"/>
+              <w:shd w:val="clear"/>
+              <w:lang w:val="en-US" w:eastAsia="zh-CN" w:bidi="ar-SA"/>
+            </w:rPr>
+            <w:t>,</w:t>
+          </w:r>
+          <w:r>
+            <w:rPr>
+              <w:rFonts w:hint="eastAsia" w:ascii="Consolas" w:hAnsi="宋体" w:eastAsia="宋体" w:cs="宋体"/>
+              <w:color w:val="BB2726"/>
+              <w:kern w:val="2"/>
+              <w:sz w:val="21"/>
+              <w:szCs w:val="24"/>
+              <w:shd w:val="clear"/>
+              <w:lang w:val="en-US" w:eastAsia="zh-CN" w:bidi="ar-SA"/>
+            </w:rPr>
+            <w:t>I2C_REG_SIZE_8BIT</w:t>
+          </w:r>
+          <w:r>
+            <w:rPr>
+              <w:rFonts w:hint="eastAsia" w:ascii="Consolas" w:hAnsi="宋体" w:eastAsia="宋体" w:cs="宋体"/>
+              <w:color w:val="252525"/>
+              <w:kern w:val="2"/>
+              <w:sz w:val="21"/>
+              <w:szCs w:val="24"/>
+              <w:shd w:val="clear"/>
+              <w:lang w:val="en-US" w:eastAsia="zh-CN" w:bidi="ar-SA"/>
+            </w:rPr>
+            <w:t>,</w:t>
+          </w:r>
+          <w:r>
+            <w:rPr>
+              <w:rFonts w:hint="eastAsia" w:ascii="Consolas" w:hAnsi="宋体" w:eastAsia="宋体" w:cs="宋体"/>
+              <w:color w:val="BB2726"/>
+              <w:kern w:val="2"/>
+              <w:sz w:val="21"/>
+              <w:szCs w:val="24"/>
+              <w:shd w:val="clear"/>
+              <w:lang w:val="en-US" w:eastAsia="zh-CN" w:bidi="ar-SA"/>
+            </w:rPr>
+            <w:t>wBuf</w:t>
+          </w:r>
+          <w:r>
+            <w:rPr>
+              <w:rFonts w:hint="eastAsia" w:ascii="Consolas" w:hAnsi="宋体" w:eastAsia="宋体" w:cs="宋体"/>
+              <w:color w:val="252525"/>
+              <w:kern w:val="2"/>
+              <w:sz w:val="21"/>
+              <w:szCs w:val="24"/>
+              <w:shd w:val="clear"/>
+              <w:lang w:val="en-US" w:eastAsia="zh-CN" w:bidi="ar-SA"/>
+            </w:rPr>
+            <w:t>,</w:t>
+          </w:r>
+          <w:r>
+            <w:rPr>
+              <w:rFonts w:hint="eastAsia" w:ascii="Consolas" w:hAnsi="宋体" w:eastAsia="宋体" w:cs="宋体"/>
+              <w:color w:val="C48200"/>
+              <w:kern w:val="2"/>
+              <w:sz w:val="21"/>
+              <w:szCs w:val="24"/>
+              <w:shd w:val="clear"/>
+              <w:lang w:val="en-US" w:eastAsia="zh-CN" w:bidi="ar-SA"/>
+            </w:rPr>
+            <w:t>2</w:t>
+          </w:r>
+          <w:r>
+            <w:rPr>
+              <w:rFonts w:hint="eastAsia" w:ascii="Consolas" w:hAnsi="宋体" w:eastAsia="宋体" w:cs="宋体"/>
+              <w:color w:val="252525"/>
+              <w:kern w:val="2"/>
+              <w:sz w:val="21"/>
+              <w:szCs w:val="24"/>
+              <w:shd w:val="clear"/>
+              <w:lang w:val="en-US" w:eastAsia="zh-CN" w:bidi="ar-SA"/>
+            </w:rPr>
+            <w:t>);</w:t>
+          </w:r>
+        </w:p>
+        <w:p>
+          <w:pPr>
+            <w:shd w:val="clear" w:fill="F5F5F5"/>
+            <w:ind w:left="480" w:leftChars="200"/>
+            <w:rPr>
+              <w:rFonts w:hint="eastAsia" w:ascii="Consolas" w:hAnsi="宋体" w:cs="宋体"/>
+              <w:sz w:val="21"/>
+              <w:szCs w:val="24"/>
+              <w:shd w:val="clear"/>
+              <w:lang w:eastAsia="zh-CN"/>
+            </w:rPr>
+          </w:pPr>
+          <w:r>
+            <w:rPr>
+              <w:rFonts w:hint="eastAsia" w:ascii="Consolas" w:hAnsi="宋体" w:eastAsia="宋体" w:cs="宋体"/>
+              <w:color w:val="909090"/>
+              <w:kern w:val="2"/>
+              <w:sz w:val="21"/>
+              <w:szCs w:val="24"/>
+              <w:shd w:val="clear"/>
+              <w:lang w:val="en-US" w:eastAsia="zh-CN" w:bidi="ar-SA"/>
+            </w:rPr>
+            <w:t>//传输完成回调：HAL_I2C_MemTxCpltCallback(I2C_HandleTypeDef *hi2c)</w:t>
+          </w:r>
+        </w:p>
+      </w:sdtContent>
+    </w:sdt>
+    <w:p>
+      <w:pPr>
+        <w:pStyle w:val="3"/>
+        <w:keepNext w:val="0"/>
+        <w:keepLines w:val="0"/>
+        <w:widowControl/>
+        <w:suppressLineNumbers w:val="0"/>
+      </w:pPr>
+      <w:r>
+        <w:t>HAL_I2C_Mem_Read_IT()</w:t>
+      </w:r>
+    </w:p>
+    <w:p>
+      <w:pPr>
+        <w:rPr>
+          <w:rFonts w:hint="eastAsia" w:ascii="宋体" w:hAnsi="宋体" w:eastAsia="宋体" w:cs="宋体"/>
+          <w:sz w:val="24"/>
+          <w:szCs w:val="24"/>
+          <w:lang w:eastAsia="zh-CN"/>
+        </w:rPr>
+      </w:pPr>
+      <w:r>
+        <w:rPr>
+          <w:rFonts w:ascii="宋体" w:hAnsi="宋体" w:eastAsia="宋体" w:cs="宋体"/>
+          <w:sz w:val="24"/>
+          <w:szCs w:val="24"/>
+        </w:rPr>
+        <w:t>功能：中断模式，I2C 读取从机指定寄存器数据</w:t>
+      </w:r>
+      <w:r>
+        <w:rPr>
+          <w:rFonts w:hint="eastAsia" w:ascii="宋体" w:hAnsi="宋体" w:cs="宋体"/>
+          <w:sz w:val="24"/>
+          <w:szCs w:val="24"/>
+          <w:lang w:eastAsia="zh-CN"/>
+        </w:rPr>
+        <w:t>。</w:t>
+      </w:r>
+    </w:p>
+    <w:p>
+      <w:pPr>
+        <w:rPr>
+          <w:rFonts w:hint="eastAsia" w:ascii="宋体" w:hAnsi="宋体" w:eastAsia="宋体" w:cs="宋体"/>
+          <w:sz w:val="24"/>
+          <w:szCs w:val="24"/>
+          <w:lang w:eastAsia="zh-CN"/>
+        </w:rPr>
+      </w:pPr>
+      <w:r>
+        <w:rPr>
+          <w:rFonts w:ascii="宋体" w:hAnsi="宋体" w:eastAsia="宋体" w:cs="宋体"/>
+          <w:sz w:val="24"/>
+          <w:szCs w:val="24"/>
+        </w:rPr>
+        <w:t>参数：I2C 句柄指针、从机地址、从机寄存器地址、寄存器地址长度、接收缓冲区指针、读取字节数</w:t>
+      </w:r>
+      <w:r>
+        <w:rPr>
+          <w:rFonts w:hint="eastAsia" w:ascii="宋体" w:hAnsi="宋体" w:cs="宋体"/>
+          <w:sz w:val="24"/>
+          <w:szCs w:val="24"/>
+          <w:lang w:eastAsia="zh-CN"/>
+        </w:rPr>
+        <w:t>。</w:t>
+      </w:r>
+    </w:p>
+    <w:p>
+      <w:pPr>
+        <w:rPr>
+          <w:rFonts w:hint="eastAsia" w:ascii="宋体" w:hAnsi="宋体" w:eastAsia="宋体" w:cs="宋体"/>
+          <w:sz w:val="24"/>
+          <w:szCs w:val="24"/>
+          <w:lang w:eastAsia="zh-CN"/>
+        </w:rPr>
+      </w:pPr>
+      <w:r>
+        <w:rPr>
+          <w:rFonts w:ascii="宋体" w:hAnsi="宋体" w:eastAsia="宋体" w:cs="宋体"/>
+          <w:sz w:val="24"/>
+          <w:szCs w:val="24"/>
+        </w:rPr>
+        <w:t>返回值：HAL 状态</w:t>
+      </w:r>
+      <w:r>
+        <w:rPr>
+          <w:rFonts w:hint="eastAsia" w:ascii="宋体" w:hAnsi="宋体" w:cs="宋体"/>
+          <w:sz w:val="24"/>
+          <w:szCs w:val="24"/>
+          <w:lang w:eastAsia="zh-CN"/>
+        </w:rPr>
+        <w:t>。</w:t>
+      </w:r>
+    </w:p>
+    <w:sdt>
+      <w:sdtPr>
+        <w:rPr>
+          <w:rFonts w:hint="eastAsia" w:ascii="Consolas" w:hAnsi="宋体" w:eastAsia="宋体" w:cs="宋体"/>
+          <w:kern w:val="2"/>
+          <w:sz w:val="21"/>
+          <w:szCs w:val="24"/>
+          <w:shd w:val="clear"/>
+          <w:lang w:val="en-US" w:eastAsia="zh-CN" w:bidi="ar-SA"/>
+        </w:rPr>
+        <w:id w:val="147455673"/>
+        <w:placeholder>
+          <w:docPart w:val="{8ef57f00-06e6-4c70-9a40-a49de4611b09}"/>
+        </w:placeholder>
+        <w15:appearance w15:val="hidden"/>
+      </w:sdtPr>
+      <w:sdtEndPr>
+        <w:rPr>
+          <w:rFonts w:ascii="Consolas" w:eastAsia="宋体" w:hAnsiTheme="minorAscii" w:cstheme="minorBidi"/>
+          <w:kern w:val="0"/>
+          <w:sz w:val="21"/>
+          <w:szCs w:val="24"/>
+          <w:shd w:val="clear"/>
+          <w:lang w:val="en-US" w:eastAsia="zh-CN" w:bidi="ar"/>
+        </w:rPr>
+      </w:sdtEndPr>
+      <w:sdtContent>
+        <w:p>
+          <w:pPr>
+            <w:shd w:val="clear" w:fill="F5F5F5"/>
+            <w:ind w:left="480" w:leftChars="200"/>
+            <w:rPr>
+              <w:rFonts w:hint="eastAsia" w:ascii="Consolas" w:hAnsi="宋体" w:eastAsia="宋体" w:cs="宋体"/>
+              <w:color w:val="252525"/>
+              <w:kern w:val="2"/>
+              <w:sz w:val="21"/>
+              <w:szCs w:val="24"/>
+              <w:shd w:val="clear"/>
+              <w:lang w:val="en-US" w:eastAsia="zh-CN" w:bidi="ar-SA"/>
+            </w:rPr>
+          </w:pPr>
+          <w:r>
+            <w:rPr>
+              <w:rFonts w:hint="eastAsia" w:ascii="Consolas" w:hAnsi="宋体" w:eastAsia="宋体" w:cs="宋体"/>
+              <w:color w:val="1E5FC7"/>
+              <w:kern w:val="2"/>
+              <w:sz w:val="21"/>
+              <w:szCs w:val="24"/>
+              <w:shd w:val="clear"/>
+              <w:lang w:val="en-US" w:eastAsia="zh-CN" w:bidi="ar-SA"/>
+            </w:rPr>
+            <w:t>uint8_t</w:t>
+          </w:r>
+          <w:r>
+            <w:rPr>
+              <w:rFonts w:hint="eastAsia" w:ascii="Consolas" w:hAnsi="宋体" w:eastAsia="宋体" w:cs="宋体"/>
+              <w:color w:val="252525"/>
+              <w:kern w:val="2"/>
+              <w:sz w:val="21"/>
+              <w:szCs w:val="24"/>
+              <w:shd w:val="clear"/>
+              <w:lang w:val="en-US" w:eastAsia="zh-CN" w:bidi="ar-SA"/>
+            </w:rPr>
+            <w:t xml:space="preserve"> </w:t>
+          </w:r>
+          <w:r>
+            <w:rPr>
+              <w:rFonts w:hint="eastAsia" w:ascii="Consolas" w:hAnsi="宋体" w:eastAsia="宋体" w:cs="宋体"/>
+              <w:color w:val="BB2726"/>
+              <w:kern w:val="2"/>
+              <w:sz w:val="21"/>
+              <w:szCs w:val="24"/>
+              <w:shd w:val="clear"/>
+              <w:lang w:val="en-US" w:eastAsia="zh-CN" w:bidi="ar-SA"/>
+            </w:rPr>
+            <w:t>rBuf</w:t>
+          </w:r>
+          <w:r>
+            <w:rPr>
+              <w:rFonts w:hint="eastAsia" w:ascii="Consolas" w:hAnsi="宋体" w:eastAsia="宋体" w:cs="宋体"/>
+              <w:color w:val="252525"/>
+              <w:kern w:val="2"/>
+              <w:sz w:val="21"/>
+              <w:szCs w:val="24"/>
+              <w:shd w:val="clear"/>
+              <w:lang w:val="en-US" w:eastAsia="zh-CN" w:bidi="ar-SA"/>
+            </w:rPr>
+            <w:t>[</w:t>
+          </w:r>
+          <w:r>
+            <w:rPr>
+              <w:rFonts w:hint="eastAsia" w:ascii="Consolas" w:hAnsi="宋体" w:eastAsia="宋体" w:cs="宋体"/>
+              <w:color w:val="C48200"/>
+              <w:kern w:val="2"/>
+              <w:sz w:val="21"/>
+              <w:szCs w:val="24"/>
+              <w:shd w:val="clear"/>
+              <w:lang w:val="en-US" w:eastAsia="zh-CN" w:bidi="ar-SA"/>
+            </w:rPr>
+            <w:t>2</w:t>
+          </w:r>
+          <w:r>
+            <w:rPr>
+              <w:rFonts w:hint="eastAsia" w:ascii="Consolas" w:hAnsi="宋体" w:eastAsia="宋体" w:cs="宋体"/>
+              <w:color w:val="252525"/>
+              <w:kern w:val="2"/>
+              <w:sz w:val="21"/>
+              <w:szCs w:val="24"/>
+              <w:shd w:val="clear"/>
+              <w:lang w:val="en-US" w:eastAsia="zh-CN" w:bidi="ar-SA"/>
+            </w:rPr>
+            <w:t>]</w:t>
+          </w:r>
+          <w:r>
+            <w:rPr>
+              <w:rFonts w:hint="eastAsia" w:ascii="Consolas" w:hAnsi="宋体" w:eastAsia="宋体" w:cs="宋体"/>
+              <w:color w:val="252525"/>
+              <w:kern w:val="2"/>
+              <w:sz w:val="21"/>
+              <w:szCs w:val="24"/>
+              <w:shd w:val="clear"/>
+              <w:lang w:val="en-US" w:eastAsia="zh-CN" w:bidi="ar-SA"/>
+            </w:rPr>
+            <w:t>;</w:t>
+          </w:r>
+        </w:p>
+        <w:p>
+          <w:pPr>
+            <w:shd w:val="clear" w:fill="F5F5F5"/>
+            <w:ind w:left="480" w:leftChars="200"/>
+            <w:rPr>
+              <w:rFonts w:hint="eastAsia" w:ascii="Consolas" w:hAnsi="宋体" w:eastAsia="宋体" w:cs="宋体"/>
+              <w:color w:val="252525"/>
+              <w:kern w:val="2"/>
+              <w:sz w:val="21"/>
+              <w:szCs w:val="24"/>
+              <w:shd w:val="clear"/>
+              <w:lang w:val="en-US" w:eastAsia="zh-CN" w:bidi="ar-SA"/>
+            </w:rPr>
+          </w:pPr>
+          <w:r>
+            <w:rPr>
+              <w:rFonts w:hint="eastAsia" w:ascii="Consolas" w:hAnsi="宋体" w:eastAsia="宋体" w:cs="宋体"/>
+              <w:color w:val="BB2726"/>
+              <w:kern w:val="2"/>
+              <w:sz w:val="21"/>
+              <w:szCs w:val="24"/>
+              <w:shd w:val="clear"/>
+              <w:lang w:val="en-US" w:eastAsia="zh-CN" w:bidi="ar-SA"/>
+            </w:rPr>
+            <w:t>HAL_I2C_Mem_Read_IT</w:t>
+          </w:r>
+          <w:r>
+            <w:rPr>
+              <w:rFonts w:hint="eastAsia" w:ascii="Consolas" w:hAnsi="宋体" w:eastAsia="宋体" w:cs="宋体"/>
+              <w:color w:val="252525"/>
+              <w:kern w:val="2"/>
+              <w:sz w:val="21"/>
+              <w:szCs w:val="24"/>
+              <w:shd w:val="clear"/>
+              <w:lang w:val="en-US" w:eastAsia="zh-CN" w:bidi="ar-SA"/>
+            </w:rPr>
+            <w:t>(&amp;</w:t>
+          </w:r>
+          <w:r>
+            <w:rPr>
+              <w:rFonts w:hint="eastAsia" w:ascii="Consolas" w:hAnsi="宋体" w:eastAsia="宋体" w:cs="宋体"/>
+              <w:color w:val="BB2726"/>
+              <w:kern w:val="2"/>
+              <w:sz w:val="21"/>
+              <w:szCs w:val="24"/>
+              <w:shd w:val="clear"/>
+              <w:lang w:val="en-US" w:eastAsia="zh-CN" w:bidi="ar-SA"/>
+            </w:rPr>
+            <w:t>hi2c1</w:t>
+          </w:r>
+          <w:r>
+            <w:rPr>
+              <w:rFonts w:hint="eastAsia" w:ascii="Consolas" w:hAnsi="宋体" w:eastAsia="宋体" w:cs="宋体"/>
+              <w:color w:val="252525"/>
+              <w:kern w:val="2"/>
+              <w:sz w:val="21"/>
+              <w:szCs w:val="24"/>
+              <w:shd w:val="clear"/>
+              <w:lang w:val="en-US" w:eastAsia="zh-CN" w:bidi="ar-SA"/>
+            </w:rPr>
+            <w:t>,</w:t>
+          </w:r>
+          <w:r>
+            <w:rPr>
+              <w:rFonts w:hint="eastAsia" w:ascii="Consolas" w:hAnsi="宋体" w:eastAsia="宋体" w:cs="宋体"/>
+              <w:color w:val="C48200"/>
+              <w:kern w:val="2"/>
+              <w:sz w:val="21"/>
+              <w:szCs w:val="24"/>
+              <w:shd w:val="clear"/>
+              <w:lang w:val="en-US" w:eastAsia="zh-CN" w:bidi="ar-SA"/>
+            </w:rPr>
+            <w:t>0xA0</w:t>
+          </w:r>
+          <w:r>
+            <w:rPr>
+              <w:rFonts w:hint="eastAsia" w:ascii="Consolas" w:hAnsi="宋体" w:eastAsia="宋体" w:cs="宋体"/>
+              <w:color w:val="252525"/>
+              <w:kern w:val="2"/>
+              <w:sz w:val="21"/>
+              <w:szCs w:val="24"/>
+              <w:shd w:val="clear"/>
+              <w:lang w:val="en-US" w:eastAsia="zh-CN" w:bidi="ar-SA"/>
+            </w:rPr>
+            <w:t>,</w:t>
+          </w:r>
+          <w:r>
+            <w:rPr>
+              <w:rFonts w:hint="eastAsia" w:ascii="Consolas" w:hAnsi="宋体" w:eastAsia="宋体" w:cs="宋体"/>
+              <w:color w:val="C48200"/>
+              <w:kern w:val="2"/>
+              <w:sz w:val="21"/>
+              <w:szCs w:val="24"/>
+              <w:shd w:val="clear"/>
+              <w:lang w:val="en-US" w:eastAsia="zh-CN" w:bidi="ar-SA"/>
+            </w:rPr>
+            <w:t>0x02</w:t>
+          </w:r>
+          <w:r>
+            <w:rPr>
+              <w:rFonts w:hint="eastAsia" w:ascii="Consolas" w:hAnsi="宋体" w:eastAsia="宋体" w:cs="宋体"/>
+              <w:color w:val="252525"/>
+              <w:kern w:val="2"/>
+              <w:sz w:val="21"/>
+              <w:szCs w:val="24"/>
+              <w:shd w:val="clear"/>
+              <w:lang w:val="en-US" w:eastAsia="zh-CN" w:bidi="ar-SA"/>
+            </w:rPr>
+            <w:t>,</w:t>
+          </w:r>
+          <w:r>
+            <w:rPr>
+              <w:rFonts w:hint="eastAsia" w:ascii="Consolas" w:hAnsi="宋体" w:eastAsia="宋体" w:cs="宋体"/>
+              <w:color w:val="BB2726"/>
+              <w:kern w:val="2"/>
+              <w:sz w:val="21"/>
+              <w:szCs w:val="24"/>
+              <w:shd w:val="clear"/>
+              <w:lang w:val="en-US" w:eastAsia="zh-CN" w:bidi="ar-SA"/>
+            </w:rPr>
+            <w:t>I2C_REG_SIZE_8BIT</w:t>
+          </w:r>
+          <w:r>
+            <w:rPr>
+              <w:rFonts w:hint="eastAsia" w:ascii="Consolas" w:hAnsi="宋体" w:eastAsia="宋体" w:cs="宋体"/>
+              <w:color w:val="252525"/>
+              <w:kern w:val="2"/>
+              <w:sz w:val="21"/>
+              <w:szCs w:val="24"/>
+              <w:shd w:val="clear"/>
+              <w:lang w:val="en-US" w:eastAsia="zh-CN" w:bidi="ar-SA"/>
+            </w:rPr>
+            <w:t>,</w:t>
+          </w:r>
+          <w:r>
+            <w:rPr>
+              <w:rFonts w:hint="eastAsia" w:ascii="Consolas" w:hAnsi="宋体" w:eastAsia="宋体" w:cs="宋体"/>
+              <w:color w:val="BB2726"/>
+              <w:kern w:val="2"/>
+              <w:sz w:val="21"/>
+              <w:szCs w:val="24"/>
+              <w:shd w:val="clear"/>
+              <w:lang w:val="en-US" w:eastAsia="zh-CN" w:bidi="ar-SA"/>
+            </w:rPr>
+            <w:t>rBuf</w:t>
+          </w:r>
+          <w:r>
+            <w:rPr>
+              <w:rFonts w:hint="eastAsia" w:ascii="Consolas" w:hAnsi="宋体" w:eastAsia="宋体" w:cs="宋体"/>
+              <w:color w:val="252525"/>
+              <w:kern w:val="2"/>
+              <w:sz w:val="21"/>
+              <w:szCs w:val="24"/>
+              <w:shd w:val="clear"/>
+              <w:lang w:val="en-US" w:eastAsia="zh-CN" w:bidi="ar-SA"/>
+            </w:rPr>
+            <w:t>,</w:t>
+          </w:r>
+          <w:r>
+            <w:rPr>
+              <w:rFonts w:hint="eastAsia" w:ascii="Consolas" w:hAnsi="宋体" w:eastAsia="宋体" w:cs="宋体"/>
+              <w:color w:val="C48200"/>
+              <w:kern w:val="2"/>
+              <w:sz w:val="21"/>
+              <w:szCs w:val="24"/>
+              <w:shd w:val="clear"/>
+              <w:lang w:val="en-US" w:eastAsia="zh-CN" w:bidi="ar-SA"/>
+            </w:rPr>
+            <w:t>2</w:t>
+          </w:r>
+          <w:r>
+            <w:rPr>
+              <w:rFonts w:hint="eastAsia" w:ascii="Consolas" w:hAnsi="宋体" w:eastAsia="宋体" w:cs="宋体"/>
+              <w:color w:val="252525"/>
+              <w:kern w:val="2"/>
+              <w:sz w:val="21"/>
+              <w:szCs w:val="24"/>
+              <w:shd w:val="clear"/>
+              <w:lang w:val="en-US" w:eastAsia="zh-CN" w:bidi="ar-SA"/>
+            </w:rPr>
+            <w:t>);</w:t>
+          </w:r>
+        </w:p>
+        <w:p>
+          <w:pPr>
+            <w:shd w:val="clear" w:fill="F5F5F5"/>
+            <w:ind w:left="480" w:leftChars="200"/>
+            <w:rPr>
+              <w:rFonts w:ascii="Consolas"/>
+              <w:sz w:val="21"/>
+              <w:shd w:val="clear"/>
+            </w:rPr>
+          </w:pPr>
+          <w:r>
+            <w:rPr>
+              <w:rFonts w:hint="eastAsia" w:ascii="Consolas" w:hAnsi="宋体" w:eastAsia="宋体" w:cs="宋体"/>
+              <w:color w:val="909090"/>
+              <w:kern w:val="2"/>
+              <w:sz w:val="21"/>
+              <w:szCs w:val="24"/>
+              <w:shd w:val="clear"/>
+              <w:lang w:val="en-US" w:eastAsia="zh-CN" w:bidi="ar-SA"/>
+            </w:rPr>
+            <w:t>//接收完成回调：HAL_I2C_MemRxCpltCallback(I2C_HandleTypeDef *hi2c)</w:t>
+          </w:r>
+        </w:p>
+      </w:sdtContent>
+    </w:sdt>
+    <w:p>
+      <w:pPr>
+        <w:pStyle w:val="3"/>
+        <w:keepNext w:val="0"/>
+        <w:keepLines w:val="0"/>
+        <w:widowControl/>
+        <w:suppressLineNumbers w:val="0"/>
+      </w:pPr>
+      <w:r>
+        <w:t>HAL_I2C_Mem_Write_DMA()</w:t>
+      </w:r>
+    </w:p>
+    <w:p>
+      <w:pPr>
+        <w:rPr>
+          <w:rFonts w:hint="eastAsia" w:ascii="宋体" w:hAnsi="宋体" w:eastAsia="宋体" w:cs="宋体"/>
+          <w:sz w:val="24"/>
+          <w:szCs w:val="24"/>
+          <w:lang w:eastAsia="zh-CN"/>
+        </w:rPr>
+      </w:pPr>
+      <w:r>
+        <w:rPr>
+          <w:rFonts w:ascii="宋体" w:hAnsi="宋体" w:eastAsia="宋体" w:cs="宋体"/>
+          <w:sz w:val="24"/>
+          <w:szCs w:val="24"/>
+        </w:rPr>
+        <w:t>功能：DMA 模式，I2C 向从机指定寄存器写入数据</w:t>
+      </w:r>
+      <w:r>
+        <w:rPr>
+          <w:rFonts w:hint="eastAsia" w:ascii="宋体" w:hAnsi="宋体" w:eastAsia="宋体" w:cs="宋体"/>
+          <w:sz w:val="24"/>
+          <w:szCs w:val="24"/>
+          <w:lang w:eastAsia="zh-CN"/>
+        </w:rPr>
+        <w:t>。</w:t>
+      </w:r>
+    </w:p>
+    <w:p>
+      <w:pPr>
+        <w:rPr>
+          <w:rFonts w:hint="eastAsia" w:ascii="宋体" w:hAnsi="宋体" w:eastAsia="宋体" w:cs="宋体"/>
+          <w:sz w:val="24"/>
+          <w:szCs w:val="24"/>
+          <w:lang w:eastAsia="zh-CN"/>
+        </w:rPr>
+      </w:pPr>
+      <w:r>
+        <w:rPr>
+          <w:rFonts w:ascii="宋体" w:hAnsi="宋体" w:eastAsia="宋体" w:cs="宋体"/>
+          <w:sz w:val="24"/>
+          <w:szCs w:val="24"/>
+        </w:rPr>
+        <w:t>参数：I2C 句柄指针、从机地址、从机寄存器地址、寄存器地址长度、数据缓冲区指针、写入字节数</w:t>
+      </w:r>
+      <w:r>
+        <w:rPr>
+          <w:rFonts w:hint="eastAsia" w:ascii="宋体" w:hAnsi="宋体" w:eastAsia="宋体" w:cs="宋体"/>
+          <w:sz w:val="24"/>
+          <w:szCs w:val="24"/>
+          <w:lang w:eastAsia="zh-CN"/>
+        </w:rPr>
+        <w:t>。</w:t>
+      </w:r>
+    </w:p>
+    <w:p>
+      <w:pPr>
+        <w:rPr>
+          <w:rFonts w:hint="eastAsia" w:ascii="宋体" w:hAnsi="宋体" w:eastAsia="宋体" w:cs="宋体"/>
+          <w:sz w:val="24"/>
+          <w:szCs w:val="24"/>
+          <w:lang w:eastAsia="zh-CN"/>
+        </w:rPr>
+      </w:pPr>
+      <w:r>
+        <w:rPr>
+          <w:rFonts w:ascii="宋体" w:hAnsi="宋体" w:eastAsia="宋体" w:cs="宋体"/>
+          <w:sz w:val="24"/>
+          <w:szCs w:val="24"/>
+        </w:rPr>
+        <w:t>返回值：HAL 状态</w:t>
+      </w:r>
+      <w:r>
+        <w:rPr>
+          <w:rFonts w:hint="eastAsia" w:ascii="宋体" w:hAnsi="宋体" w:eastAsia="宋体" w:cs="宋体"/>
+          <w:sz w:val="24"/>
+          <w:szCs w:val="24"/>
+          <w:lang w:eastAsia="zh-CN"/>
+        </w:rPr>
+        <w:t>。</w:t>
+      </w:r>
+    </w:p>
+    <w:sdt>
+      <w:sdtPr>
+        <w:rPr>
+          <w:rFonts w:hint="eastAsia" w:ascii="Consolas" w:hAnsi="宋体" w:eastAsia="宋体" w:cs="宋体"/>
+          <w:kern w:val="2"/>
+          <w:sz w:val="21"/>
+          <w:szCs w:val="24"/>
+          <w:shd w:val="clear"/>
+          <w:lang w:val="en-US" w:eastAsia="zh-CN" w:bidi="ar-SA"/>
+        </w:rPr>
+        <w:id w:val="147455422"/>
+        <w:placeholder>
+          <w:docPart w:val="{ff570d7e-b696-49ef-918e-facc973a3292}"/>
+        </w:placeholder>
+        <w15:appearance w15:val="hidden"/>
+      </w:sdtPr>
+      <w:sdtEndPr>
+        <w:rPr>
+          <w:rFonts w:hint="eastAsia" w:ascii="Consolas" w:hAnsi="宋体" w:eastAsia="宋体" w:cs="宋体"/>
+          <w:kern w:val="2"/>
+          <w:sz w:val="21"/>
+          <w:szCs w:val="24"/>
+          <w:shd w:val="clear"/>
+          <w:lang w:val="en-US" w:eastAsia="zh-CN" w:bidi="ar-SA"/>
+        </w:rPr>
+      </w:sdtEndPr>
+      <w:sdtContent>
+        <w:p>
+          <w:pPr>
+            <w:shd w:val="clear" w:fill="F5F5F5"/>
+            <w:ind w:left="480" w:leftChars="200"/>
+            <w:rPr>
+              <w:rFonts w:hint="eastAsia" w:ascii="Consolas" w:hAnsi="宋体" w:eastAsia="宋体" w:cs="宋体"/>
+              <w:color w:val="252525"/>
+              <w:kern w:val="2"/>
+              <w:sz w:val="21"/>
+              <w:szCs w:val="24"/>
+              <w:shd w:val="clear"/>
+              <w:lang w:val="en-US" w:eastAsia="zh-CN" w:bidi="ar-SA"/>
+            </w:rPr>
+          </w:pPr>
+          <w:r>
+            <w:rPr>
+              <w:rFonts w:hint="eastAsia" w:ascii="Consolas" w:hAnsi="宋体" w:eastAsia="宋体" w:cs="宋体"/>
+              <w:color w:val="1E5FC7"/>
+              <w:kern w:val="2"/>
+              <w:sz w:val="21"/>
+              <w:szCs w:val="24"/>
+              <w:shd w:val="clear"/>
+              <w:lang w:val="en-US" w:eastAsia="zh-CN" w:bidi="ar-SA"/>
+            </w:rPr>
+            <w:t>uint8_t</w:t>
+          </w:r>
+          <w:r>
+            <w:rPr>
+              <w:rFonts w:hint="eastAsia" w:ascii="Consolas" w:hAnsi="宋体" w:eastAsia="宋体" w:cs="宋体"/>
+              <w:color w:val="252525"/>
+              <w:kern w:val="2"/>
+              <w:sz w:val="21"/>
+              <w:szCs w:val="24"/>
+              <w:shd w:val="clear"/>
+              <w:lang w:val="en-US" w:eastAsia="zh-CN" w:bidi="ar-SA"/>
+            </w:rPr>
+            <w:t xml:space="preserve"> </w:t>
+          </w:r>
+          <w:r>
+            <w:rPr>
+              <w:rFonts w:hint="eastAsia" w:ascii="Consolas" w:hAnsi="宋体" w:eastAsia="宋体" w:cs="宋体"/>
+              <w:color w:val="BB2726"/>
+              <w:kern w:val="2"/>
+              <w:sz w:val="21"/>
+              <w:szCs w:val="24"/>
+              <w:shd w:val="clear"/>
+              <w:lang w:val="en-US" w:eastAsia="zh-CN" w:bidi="ar-SA"/>
+            </w:rPr>
+            <w:t>wBuf</w:t>
+          </w:r>
+          <w:r>
+            <w:rPr>
+              <w:rFonts w:hint="eastAsia" w:ascii="Consolas" w:hAnsi="宋体" w:eastAsia="宋体" w:cs="宋体"/>
+              <w:color w:val="252525"/>
+              <w:kern w:val="2"/>
+              <w:sz w:val="21"/>
+              <w:szCs w:val="24"/>
+              <w:shd w:val="clear"/>
+              <w:lang w:val="en-US" w:eastAsia="zh-CN" w:bidi="ar-SA"/>
+            </w:rPr>
+            <w:t>[</w:t>
+          </w:r>
+          <w:r>
+            <w:rPr>
+              <w:rFonts w:hint="eastAsia" w:ascii="Consolas" w:hAnsi="宋体" w:eastAsia="宋体" w:cs="宋体"/>
+              <w:color w:val="C48200"/>
+              <w:kern w:val="2"/>
+              <w:sz w:val="21"/>
+              <w:szCs w:val="24"/>
+              <w:shd w:val="clear"/>
+              <w:lang w:val="en-US" w:eastAsia="zh-CN" w:bidi="ar-SA"/>
+            </w:rPr>
+            <w:t>2</w:t>
+          </w:r>
+          <w:r>
+            <w:rPr>
+              <w:rFonts w:hint="eastAsia" w:ascii="Consolas" w:hAnsi="宋体" w:eastAsia="宋体" w:cs="宋体"/>
+              <w:color w:val="252525"/>
+              <w:kern w:val="2"/>
+              <w:sz w:val="21"/>
+              <w:szCs w:val="24"/>
+              <w:shd w:val="clear"/>
+              <w:lang w:val="en-US" w:eastAsia="zh-CN" w:bidi="ar-SA"/>
+            </w:rPr>
+            <w:t>] = {</w:t>
+          </w:r>
+          <w:r>
+            <w:rPr>
+              <w:rFonts w:hint="eastAsia" w:ascii="Consolas" w:hAnsi="宋体" w:eastAsia="宋体" w:cs="宋体"/>
+              <w:color w:val="C48200"/>
+              <w:kern w:val="2"/>
+              <w:sz w:val="21"/>
+              <w:szCs w:val="24"/>
+              <w:shd w:val="clear"/>
+              <w:lang w:val="en-US" w:eastAsia="zh-CN" w:bidi="ar-SA"/>
+            </w:rPr>
+            <w:t>0x55</w:t>
+          </w:r>
+          <w:r>
+            <w:rPr>
+              <w:rFonts w:hint="eastAsia" w:ascii="Consolas" w:hAnsi="宋体" w:eastAsia="宋体" w:cs="宋体"/>
+              <w:color w:val="252525"/>
+              <w:kern w:val="2"/>
+              <w:sz w:val="21"/>
+              <w:szCs w:val="24"/>
+              <w:shd w:val="clear"/>
+              <w:lang w:val="en-US" w:eastAsia="zh-CN" w:bidi="ar-SA"/>
+            </w:rPr>
+            <w:t>,</w:t>
+          </w:r>
+          <w:r>
+            <w:rPr>
+              <w:rFonts w:hint="eastAsia" w:ascii="Consolas" w:hAnsi="宋体" w:eastAsia="宋体" w:cs="宋体"/>
+              <w:color w:val="C48200"/>
+              <w:kern w:val="2"/>
+              <w:sz w:val="21"/>
+              <w:szCs w:val="24"/>
+              <w:shd w:val="clear"/>
+              <w:lang w:val="en-US" w:eastAsia="zh-CN" w:bidi="ar-SA"/>
+            </w:rPr>
+            <w:t>0x66</w:t>
+          </w:r>
+          <w:r>
+            <w:rPr>
+              <w:rFonts w:hint="eastAsia" w:ascii="Consolas" w:hAnsi="宋体" w:eastAsia="宋体" w:cs="宋体"/>
+              <w:color w:val="252525"/>
+              <w:kern w:val="2"/>
+              <w:sz w:val="21"/>
+              <w:szCs w:val="24"/>
+              <w:shd w:val="clear"/>
+              <w:lang w:val="en-US" w:eastAsia="zh-CN" w:bidi="ar-SA"/>
+            </w:rPr>
+            <w:t>};</w:t>
+          </w:r>
+        </w:p>
+        <w:p>
+          <w:pPr>
+            <w:shd w:val="clear" w:fill="F5F5F5"/>
+            <w:ind w:left="480" w:leftChars="200"/>
+            <w:rPr>
+              <w:rFonts w:hint="eastAsia" w:ascii="Consolas" w:hAnsi="宋体" w:eastAsia="宋体" w:cs="宋体"/>
+              <w:color w:val="252525"/>
+              <w:kern w:val="2"/>
+              <w:sz w:val="21"/>
+              <w:szCs w:val="24"/>
+              <w:shd w:val="clear"/>
+              <w:lang w:val="en-US" w:eastAsia="zh-CN" w:bidi="ar-SA"/>
+            </w:rPr>
+          </w:pPr>
+          <w:r>
+            <w:rPr>
+              <w:rFonts w:hint="eastAsia" w:ascii="Consolas" w:hAnsi="宋体" w:eastAsia="宋体" w:cs="宋体"/>
+              <w:color w:val="BB2726"/>
+              <w:kern w:val="2"/>
+              <w:sz w:val="21"/>
+              <w:szCs w:val="24"/>
+              <w:shd w:val="clear"/>
+              <w:lang w:val="en-US" w:eastAsia="zh-CN" w:bidi="ar-SA"/>
+            </w:rPr>
+            <w:t>HAL_I2C_Mem_Write_DMA</w:t>
+          </w:r>
+          <w:r>
+            <w:rPr>
+              <w:rFonts w:hint="eastAsia" w:ascii="Consolas" w:hAnsi="宋体" w:eastAsia="宋体" w:cs="宋体"/>
+              <w:color w:val="252525"/>
+              <w:kern w:val="2"/>
+              <w:sz w:val="21"/>
+              <w:szCs w:val="24"/>
+              <w:shd w:val="clear"/>
+              <w:lang w:val="en-US" w:eastAsia="zh-CN" w:bidi="ar-SA"/>
+            </w:rPr>
+            <w:t>(&amp;</w:t>
+          </w:r>
+          <w:r>
+            <w:rPr>
+              <w:rFonts w:hint="eastAsia" w:ascii="Consolas" w:hAnsi="宋体" w:eastAsia="宋体" w:cs="宋体"/>
+              <w:color w:val="BB2726"/>
+              <w:kern w:val="2"/>
+              <w:sz w:val="21"/>
+              <w:szCs w:val="24"/>
+              <w:shd w:val="clear"/>
+              <w:lang w:val="en-US" w:eastAsia="zh-CN" w:bidi="ar-SA"/>
+            </w:rPr>
+            <w:t>hi2c1</w:t>
+          </w:r>
+          <w:r>
+            <w:rPr>
+              <w:rFonts w:hint="eastAsia" w:ascii="Consolas" w:hAnsi="宋体" w:eastAsia="宋体" w:cs="宋体"/>
+              <w:color w:val="252525"/>
+              <w:kern w:val="2"/>
+              <w:sz w:val="21"/>
+              <w:szCs w:val="24"/>
+              <w:shd w:val="clear"/>
+              <w:lang w:val="en-US" w:eastAsia="zh-CN" w:bidi="ar-SA"/>
+            </w:rPr>
+            <w:t>,</w:t>
+          </w:r>
+          <w:r>
+            <w:rPr>
+              <w:rFonts w:hint="eastAsia" w:ascii="Consolas" w:hAnsi="宋体" w:eastAsia="宋体" w:cs="宋体"/>
+              <w:color w:val="C48200"/>
+              <w:kern w:val="2"/>
+              <w:sz w:val="21"/>
+              <w:szCs w:val="24"/>
+              <w:shd w:val="clear"/>
+              <w:lang w:val="en-US" w:eastAsia="zh-CN" w:bidi="ar-SA"/>
+            </w:rPr>
+            <w:t>0xA0</w:t>
+          </w:r>
+          <w:r>
+            <w:rPr>
+              <w:rFonts w:hint="eastAsia" w:ascii="Consolas" w:hAnsi="宋体" w:eastAsia="宋体" w:cs="宋体"/>
+              <w:color w:val="252525"/>
+              <w:kern w:val="2"/>
+              <w:sz w:val="21"/>
+              <w:szCs w:val="24"/>
+              <w:shd w:val="clear"/>
+              <w:lang w:val="en-US" w:eastAsia="zh-CN" w:bidi="ar-SA"/>
+            </w:rPr>
+            <w:t>,</w:t>
+          </w:r>
+          <w:r>
+            <w:rPr>
+              <w:rFonts w:hint="eastAsia" w:ascii="Consolas" w:hAnsi="宋体" w:eastAsia="宋体" w:cs="宋体"/>
+              <w:color w:val="C48200"/>
+              <w:kern w:val="2"/>
+              <w:sz w:val="21"/>
+              <w:szCs w:val="24"/>
+              <w:shd w:val="clear"/>
+              <w:lang w:val="en-US" w:eastAsia="zh-CN" w:bidi="ar-SA"/>
+            </w:rPr>
+            <w:t>0x02</w:t>
+          </w:r>
+          <w:r>
+            <w:rPr>
+              <w:rFonts w:hint="eastAsia" w:ascii="Consolas" w:hAnsi="宋体" w:eastAsia="宋体" w:cs="宋体"/>
+              <w:color w:val="252525"/>
+              <w:kern w:val="2"/>
+              <w:sz w:val="21"/>
+              <w:szCs w:val="24"/>
+              <w:shd w:val="clear"/>
+              <w:lang w:val="en-US" w:eastAsia="zh-CN" w:bidi="ar-SA"/>
+            </w:rPr>
+            <w:t>,</w:t>
+          </w:r>
+          <w:r>
+            <w:rPr>
+              <w:rFonts w:hint="eastAsia" w:ascii="Consolas" w:hAnsi="宋体" w:eastAsia="宋体" w:cs="宋体"/>
+              <w:color w:val="BB2726"/>
+              <w:kern w:val="2"/>
+              <w:sz w:val="21"/>
+              <w:szCs w:val="24"/>
+              <w:shd w:val="clear"/>
+              <w:lang w:val="en-US" w:eastAsia="zh-CN" w:bidi="ar-SA"/>
+            </w:rPr>
+            <w:t>I2C_</w:t>
+          </w:r>
+          <w:r>
+            <w:rPr>
+              <w:rFonts w:hint="eastAsia" w:ascii="Consolas" w:hAnsi="宋体" w:cs="宋体"/>
+              <w:color w:val="BB2726"/>
+              <w:kern w:val="2"/>
+              <w:sz w:val="21"/>
+              <w:szCs w:val="24"/>
+              <w:shd w:val="clear"/>
+              <w:lang w:val="en-US" w:eastAsia="zh-CN" w:bidi="ar-SA"/>
+            </w:rPr>
+            <w:t>REG</w:t>
+          </w:r>
+          <w:r>
+            <w:rPr>
+              <w:rFonts w:hint="eastAsia" w:ascii="Consolas" w:hAnsi="宋体" w:eastAsia="宋体" w:cs="宋体"/>
+              <w:color w:val="BB2726"/>
+              <w:kern w:val="2"/>
+              <w:sz w:val="21"/>
+              <w:szCs w:val="24"/>
+              <w:shd w:val="clear"/>
+              <w:lang w:val="en-US" w:eastAsia="zh-CN" w:bidi="ar-SA"/>
+            </w:rPr>
+            <w:t>_SIZE_8BIT</w:t>
+          </w:r>
+          <w:r>
+            <w:rPr>
+              <w:rFonts w:hint="eastAsia" w:ascii="Consolas" w:hAnsi="宋体" w:eastAsia="宋体" w:cs="宋体"/>
+              <w:color w:val="252525"/>
+              <w:kern w:val="2"/>
+              <w:sz w:val="21"/>
+              <w:szCs w:val="24"/>
+              <w:shd w:val="clear"/>
+              <w:lang w:val="en-US" w:eastAsia="zh-CN" w:bidi="ar-SA"/>
+            </w:rPr>
+            <w:t>,</w:t>
+          </w:r>
+          <w:r>
+            <w:rPr>
+              <w:rFonts w:hint="eastAsia" w:ascii="Consolas" w:hAnsi="宋体" w:eastAsia="宋体" w:cs="宋体"/>
+              <w:color w:val="BB2726"/>
+              <w:kern w:val="2"/>
+              <w:sz w:val="21"/>
+              <w:szCs w:val="24"/>
+              <w:shd w:val="clear"/>
+              <w:lang w:val="en-US" w:eastAsia="zh-CN" w:bidi="ar-SA"/>
+            </w:rPr>
+            <w:t>wBuf</w:t>
+          </w:r>
+          <w:r>
+            <w:rPr>
+              <w:rFonts w:hint="eastAsia" w:ascii="Consolas" w:hAnsi="宋体" w:eastAsia="宋体" w:cs="宋体"/>
+              <w:color w:val="252525"/>
+              <w:kern w:val="2"/>
+              <w:sz w:val="21"/>
+              <w:szCs w:val="24"/>
+              <w:shd w:val="clear"/>
+              <w:lang w:val="en-US" w:eastAsia="zh-CN" w:bidi="ar-SA"/>
+            </w:rPr>
+            <w:t>,</w:t>
+          </w:r>
+          <w:r>
+            <w:rPr>
+              <w:rFonts w:hint="eastAsia" w:ascii="Consolas" w:hAnsi="宋体" w:eastAsia="宋体" w:cs="宋体"/>
+              <w:color w:val="C48200"/>
+              <w:kern w:val="2"/>
+              <w:sz w:val="21"/>
+              <w:szCs w:val="24"/>
+              <w:shd w:val="clear"/>
+              <w:lang w:val="en-US" w:eastAsia="zh-CN" w:bidi="ar-SA"/>
+            </w:rPr>
+            <w:t>2</w:t>
+          </w:r>
+          <w:r>
+            <w:rPr>
+              <w:rFonts w:hint="eastAsia" w:ascii="Consolas" w:hAnsi="宋体" w:eastAsia="宋体" w:cs="宋体"/>
+              <w:color w:val="252525"/>
+              <w:kern w:val="2"/>
+              <w:sz w:val="21"/>
+              <w:szCs w:val="24"/>
+              <w:shd w:val="clear"/>
+              <w:lang w:val="en-US" w:eastAsia="zh-CN" w:bidi="ar-SA"/>
+            </w:rPr>
+            <w:t>);</w:t>
+          </w:r>
+        </w:p>
+        <w:p>
+          <w:pPr>
+            <w:shd w:val="clear" w:fill="F5F5F5"/>
+            <w:ind w:left="480" w:leftChars="200"/>
+            <w:rPr>
+              <w:rFonts w:hint="eastAsia" w:ascii="Consolas" w:hAnsi="宋体" w:eastAsia="宋体" w:cs="宋体"/>
+              <w:sz w:val="21"/>
+              <w:szCs w:val="24"/>
+              <w:shd w:val="clear"/>
+              <w:lang w:eastAsia="zh-CN"/>
+            </w:rPr>
+          </w:pPr>
+          <w:r>
+            <w:rPr>
+              <w:rFonts w:hint="eastAsia" w:ascii="Consolas" w:hAnsi="宋体" w:eastAsia="宋体" w:cs="宋体"/>
+              <w:color w:val="909090"/>
+              <w:kern w:val="2"/>
+              <w:sz w:val="21"/>
+              <w:szCs w:val="24"/>
+              <w:shd w:val="clear"/>
+              <w:lang w:val="en-US" w:eastAsia="zh-CN" w:bidi="ar-SA"/>
+            </w:rPr>
+            <w:t>//DMA传输完成回调：HAL_I2C_MemTxCpltCallback(I2C_HandleTypeDef *hi2c)</w:t>
+          </w:r>
+        </w:p>
+      </w:sdtContent>
+    </w:sdt>
+    <w:p>
+      <w:pPr>
+        <w:pStyle w:val="3"/>
+        <w:keepNext w:val="0"/>
+        <w:keepLines w:val="0"/>
+        <w:widowControl/>
+        <w:suppressLineNumbers w:val="0"/>
+      </w:pPr>
+      <w:r>
+        <w:t>HAL_I2C_Mem_Read_DMA()</w:t>
+      </w:r>
+    </w:p>
+    <w:p>
+      <w:pPr>
+        <w:rPr>
+          <w:rFonts w:hint="eastAsia" w:ascii="宋体" w:hAnsi="宋体" w:eastAsia="宋体" w:cs="宋体"/>
+          <w:sz w:val="24"/>
+          <w:szCs w:val="24"/>
+          <w:lang w:eastAsia="zh-CN"/>
+        </w:rPr>
+      </w:pPr>
+      <w:r>
+        <w:t>功</w:t>
+      </w:r>
+      <w:r>
+        <w:rPr>
+          <w:rFonts w:ascii="宋体" w:hAnsi="宋体" w:eastAsia="宋体" w:cs="宋体"/>
+          <w:sz w:val="24"/>
+          <w:szCs w:val="24"/>
+        </w:rPr>
+        <w:t>能：DMA 模式，I2C 读取从机指定寄存器数据</w:t>
+      </w:r>
+      <w:r>
+        <w:rPr>
+          <w:rFonts w:hint="eastAsia" w:ascii="宋体" w:hAnsi="宋体" w:cs="宋体"/>
+          <w:sz w:val="24"/>
+          <w:szCs w:val="24"/>
+          <w:lang w:eastAsia="zh-CN"/>
+        </w:rPr>
+        <w:t>。</w:t>
+      </w:r>
+    </w:p>
+    <w:p>
+      <w:pPr>
+        <w:rPr>
+          <w:rFonts w:hint="eastAsia" w:ascii="宋体" w:hAnsi="宋体" w:eastAsia="宋体" w:cs="宋体"/>
+          <w:sz w:val="24"/>
+          <w:szCs w:val="24"/>
+          <w:lang w:eastAsia="zh-CN"/>
+        </w:rPr>
+      </w:pPr>
+      <w:r>
+        <w:rPr>
+          <w:rFonts w:ascii="宋体" w:hAnsi="宋体" w:eastAsia="宋体" w:cs="宋体"/>
+          <w:sz w:val="24"/>
+          <w:szCs w:val="24"/>
+        </w:rPr>
+        <w:t>参数：I2C 句柄指针、从机地址、从机寄存器地址、寄存器地址长度、接收缓冲区指针、读取字节数</w:t>
+      </w:r>
+      <w:r>
+        <w:rPr>
+          <w:rFonts w:hint="eastAsia" w:ascii="宋体" w:hAnsi="宋体" w:cs="宋体"/>
+          <w:sz w:val="24"/>
+          <w:szCs w:val="24"/>
+          <w:lang w:eastAsia="zh-CN"/>
+        </w:rPr>
+        <w:t>。</w:t>
+      </w:r>
+    </w:p>
+    <w:p>
+      <w:pPr>
+        <w:rPr>
+          <w:rFonts w:hint="eastAsia"/>
+          <w:lang w:val="en-US" w:eastAsia="zh-CN"/>
+        </w:rPr>
+      </w:pPr>
+      <w:r>
+        <w:rPr>
+          <w:rFonts w:ascii="宋体" w:hAnsi="宋体" w:eastAsia="宋体" w:cs="宋体"/>
+          <w:sz w:val="24"/>
+          <w:szCs w:val="24"/>
+        </w:rPr>
+        <w:t>返回值：HAL 状态</w:t>
+      </w:r>
+      <w:r>
+        <w:rPr>
+          <w:rFonts w:hint="eastAsia" w:ascii="宋体" w:hAnsi="宋体" w:cs="宋体"/>
+          <w:sz w:val="24"/>
+          <w:szCs w:val="24"/>
+          <w:lang w:eastAsia="zh-CN"/>
+        </w:rPr>
+        <w:t>。</w:t>
+      </w:r>
+    </w:p>
+    <w:sdt>
+      <w:sdtPr>
+        <w:rPr>
+          <w:rFonts w:hint="eastAsia" w:ascii="Consolas" w:eastAsia="宋体" w:hAnsiTheme="minorAscii" w:cstheme="minorBidi"/>
+          <w:kern w:val="2"/>
+          <w:sz w:val="21"/>
+          <w:szCs w:val="24"/>
+          <w:shd w:val="clear"/>
+          <w:lang w:val="en-US" w:eastAsia="zh-CN" w:bidi="ar-SA"/>
+        </w:rPr>
+        <w:id w:val="147454755"/>
+        <w:placeholder>
+          <w:docPart w:val="{89f6e782-d2fa-4a87-95b2-bdc26956baee}"/>
+        </w:placeholder>
+        <w15:appearance w15:val="hidden"/>
+      </w:sdtPr>
+      <w:sdtEndPr>
+        <w:rPr>
+          <w:rFonts w:hint="eastAsia" w:ascii="Consolas" w:eastAsia="宋体" w:hAnsiTheme="minorAscii" w:cstheme="minorBidi"/>
+          <w:kern w:val="2"/>
+          <w:sz w:val="21"/>
+          <w:szCs w:val="24"/>
+          <w:shd w:val="clear"/>
+          <w:lang w:val="en-US" w:eastAsia="zh-CN" w:bidi="ar-SA"/>
+        </w:rPr>
+      </w:sdtEndPr>
+      <w:sdtContent>
+        <w:p>
+          <w:pPr>
+            <w:shd w:val="clear" w:fill="F5F5F5"/>
+            <w:ind w:left="480" w:leftChars="200"/>
+            <w:rPr>
+              <w:rFonts w:hint="eastAsia" w:ascii="Consolas" w:eastAsia="宋体" w:hAnsiTheme="minorAscii" w:cstheme="minorBidi"/>
+              <w:color w:val="252525"/>
+              <w:kern w:val="2"/>
+              <w:sz w:val="21"/>
+              <w:szCs w:val="24"/>
+              <w:shd w:val="clear"/>
+              <w:lang w:val="en-US" w:eastAsia="zh-CN" w:bidi="ar-SA"/>
+            </w:rPr>
+          </w:pPr>
+          <w:r>
+            <w:rPr>
+              <w:rFonts w:hint="eastAsia" w:ascii="Consolas" w:eastAsia="宋体" w:hAnsiTheme="minorAscii" w:cstheme="minorBidi"/>
+              <w:color w:val="1E5FC7"/>
+              <w:kern w:val="2"/>
+              <w:sz w:val="21"/>
+              <w:szCs w:val="24"/>
+              <w:shd w:val="clear"/>
+              <w:lang w:val="en-US" w:eastAsia="zh-CN" w:bidi="ar-SA"/>
+            </w:rPr>
+            <w:t>uint8_t</w:t>
+          </w:r>
+          <w:r>
+            <w:rPr>
+              <w:rFonts w:hint="eastAsia" w:ascii="Consolas" w:eastAsia="宋体" w:hAnsiTheme="minorAscii" w:cstheme="minorBidi"/>
+              <w:color w:val="252525"/>
+              <w:kern w:val="2"/>
+              <w:sz w:val="21"/>
+              <w:szCs w:val="24"/>
+              <w:shd w:val="clear"/>
+              <w:lang w:val="en-US" w:eastAsia="zh-CN" w:bidi="ar-SA"/>
+            </w:rPr>
+            <w:t xml:space="preserve"> </w:t>
+          </w:r>
+          <w:r>
+            <w:rPr>
+              <w:rFonts w:hint="eastAsia" w:ascii="Consolas" w:eastAsia="宋体" w:hAnsiTheme="minorAscii" w:cstheme="minorBidi"/>
+              <w:color w:val="BB2726"/>
+              <w:kern w:val="2"/>
+              <w:sz w:val="21"/>
+              <w:szCs w:val="24"/>
+              <w:shd w:val="clear"/>
+              <w:lang w:val="en-US" w:eastAsia="zh-CN" w:bidi="ar-SA"/>
+            </w:rPr>
+            <w:t>rBuf</w:t>
+          </w:r>
+          <w:r>
+            <w:rPr>
+              <w:rFonts w:hint="eastAsia" w:ascii="Consolas" w:eastAsia="宋体" w:hAnsiTheme="minorAscii" w:cstheme="minorBidi"/>
+              <w:color w:val="252525"/>
+              <w:kern w:val="2"/>
+              <w:sz w:val="21"/>
+              <w:szCs w:val="24"/>
+              <w:shd w:val="clear"/>
+              <w:lang w:val="en-US" w:eastAsia="zh-CN" w:bidi="ar-SA"/>
+            </w:rPr>
+            <w:t>[</w:t>
+          </w:r>
+          <w:r>
+            <w:rPr>
+              <w:rFonts w:hint="eastAsia" w:ascii="Consolas" w:eastAsia="宋体" w:hAnsiTheme="minorAscii" w:cstheme="minorBidi"/>
+              <w:color w:val="C48200"/>
+              <w:kern w:val="2"/>
+              <w:sz w:val="21"/>
+              <w:szCs w:val="24"/>
+              <w:shd w:val="clear"/>
+              <w:lang w:val="en-US" w:eastAsia="zh-CN" w:bidi="ar-SA"/>
+            </w:rPr>
+            <w:t>2</w:t>
+          </w:r>
+          <w:r>
+            <w:rPr>
+              <w:rFonts w:hint="eastAsia" w:ascii="Consolas" w:eastAsia="宋体" w:hAnsiTheme="minorAscii" w:cstheme="minorBidi"/>
+              <w:color w:val="252525"/>
+              <w:kern w:val="2"/>
+              <w:sz w:val="21"/>
+              <w:szCs w:val="24"/>
+              <w:shd w:val="clear"/>
+              <w:lang w:val="en-US" w:eastAsia="zh-CN" w:bidi="ar-SA"/>
+            </w:rPr>
+            <w:t>];</w:t>
+          </w:r>
+        </w:p>
+        <w:p>
+          <w:pPr>
+            <w:shd w:val="clear" w:fill="F5F5F5"/>
+            <w:ind w:left="480" w:leftChars="200"/>
+            <w:rPr>
+              <w:rFonts w:hint="eastAsia" w:ascii="Consolas" w:eastAsia="宋体" w:hAnsiTheme="minorAscii" w:cstheme="minorBidi"/>
+              <w:color w:val="252525"/>
+              <w:kern w:val="2"/>
+              <w:sz w:val="21"/>
+              <w:szCs w:val="24"/>
+              <w:shd w:val="clear"/>
+              <w:lang w:val="en-US" w:eastAsia="zh-CN" w:bidi="ar-SA"/>
+            </w:rPr>
+          </w:pPr>
+          <w:r>
+            <w:rPr>
+              <w:rFonts w:hint="eastAsia" w:ascii="Consolas" w:eastAsia="宋体" w:hAnsiTheme="minorAscii" w:cstheme="minorBidi"/>
+              <w:color w:val="BB2726"/>
+              <w:kern w:val="2"/>
+              <w:sz w:val="21"/>
+              <w:szCs w:val="24"/>
+              <w:shd w:val="clear"/>
+              <w:lang w:val="en-US" w:eastAsia="zh-CN" w:bidi="ar-SA"/>
+            </w:rPr>
+            <w:t>HAL_I2C_Mem_Read_DMA</w:t>
+          </w:r>
+          <w:r>
+            <w:rPr>
+              <w:rFonts w:hint="eastAsia" w:ascii="Consolas" w:eastAsia="宋体" w:hAnsiTheme="minorAscii" w:cstheme="minorBidi"/>
+              <w:color w:val="252525"/>
+              <w:kern w:val="2"/>
+              <w:sz w:val="21"/>
+              <w:szCs w:val="24"/>
+              <w:shd w:val="clear"/>
+              <w:lang w:val="en-US" w:eastAsia="zh-CN" w:bidi="ar-SA"/>
+            </w:rPr>
+            <w:t>(&amp;</w:t>
+          </w:r>
+          <w:r>
+            <w:rPr>
+              <w:rFonts w:hint="eastAsia" w:ascii="Consolas" w:eastAsia="宋体" w:hAnsiTheme="minorAscii" w:cstheme="minorBidi"/>
+              <w:color w:val="BB2726"/>
+              <w:kern w:val="2"/>
+              <w:sz w:val="21"/>
+              <w:szCs w:val="24"/>
+              <w:shd w:val="clear"/>
+              <w:lang w:val="en-US" w:eastAsia="zh-CN" w:bidi="ar-SA"/>
+            </w:rPr>
+            <w:t>hi2c1</w:t>
+          </w:r>
+          <w:r>
+            <w:rPr>
+              <w:rFonts w:hint="eastAsia" w:ascii="Consolas" w:eastAsia="宋体" w:hAnsiTheme="minorAscii" w:cstheme="minorBidi"/>
+              <w:color w:val="252525"/>
+              <w:kern w:val="2"/>
+              <w:sz w:val="21"/>
+              <w:szCs w:val="24"/>
+              <w:shd w:val="clear"/>
+              <w:lang w:val="en-US" w:eastAsia="zh-CN" w:bidi="ar-SA"/>
+            </w:rPr>
+            <w:t>,</w:t>
+          </w:r>
+          <w:r>
+            <w:rPr>
+              <w:rFonts w:hint="eastAsia" w:ascii="Consolas" w:eastAsia="宋体" w:hAnsiTheme="minorAscii" w:cstheme="minorBidi"/>
+              <w:color w:val="C48200"/>
+              <w:kern w:val="2"/>
+              <w:sz w:val="21"/>
+              <w:szCs w:val="24"/>
+              <w:shd w:val="clear"/>
+              <w:lang w:val="en-US" w:eastAsia="zh-CN" w:bidi="ar-SA"/>
+            </w:rPr>
+            <w:t>0xA0</w:t>
+          </w:r>
+          <w:r>
+            <w:rPr>
+              <w:rFonts w:hint="eastAsia" w:ascii="Consolas" w:eastAsia="宋体" w:hAnsiTheme="minorAscii" w:cstheme="minorBidi"/>
+              <w:color w:val="252525"/>
+              <w:kern w:val="2"/>
+              <w:sz w:val="21"/>
+              <w:szCs w:val="24"/>
+              <w:shd w:val="clear"/>
+              <w:lang w:val="en-US" w:eastAsia="zh-CN" w:bidi="ar-SA"/>
+            </w:rPr>
+            <w:t>,</w:t>
+          </w:r>
+          <w:r>
+            <w:rPr>
+              <w:rFonts w:hint="eastAsia" w:ascii="Consolas" w:eastAsia="宋体" w:hAnsiTheme="minorAscii" w:cstheme="minorBidi"/>
+              <w:color w:val="C48200"/>
+              <w:kern w:val="2"/>
+              <w:sz w:val="21"/>
+              <w:szCs w:val="24"/>
+              <w:shd w:val="clear"/>
+              <w:lang w:val="en-US" w:eastAsia="zh-CN" w:bidi="ar-SA"/>
+            </w:rPr>
+            <w:t>0x02</w:t>
+          </w:r>
+          <w:r>
+            <w:rPr>
+              <w:rFonts w:hint="eastAsia" w:ascii="Consolas" w:eastAsia="宋体" w:hAnsiTheme="minorAscii" w:cstheme="minorBidi"/>
+              <w:color w:val="252525"/>
+              <w:kern w:val="2"/>
+              <w:sz w:val="21"/>
+              <w:szCs w:val="24"/>
+              <w:shd w:val="clear"/>
+              <w:lang w:val="en-US" w:eastAsia="zh-CN" w:bidi="ar-SA"/>
+            </w:rPr>
+            <w:t>,</w:t>
+          </w:r>
+          <w:r>
+            <w:rPr>
+              <w:rFonts w:hint="eastAsia" w:ascii="Consolas" w:eastAsia="宋体" w:hAnsiTheme="minorAscii" w:cstheme="minorBidi"/>
+              <w:color w:val="BB2726"/>
+              <w:kern w:val="2"/>
+              <w:sz w:val="21"/>
+              <w:szCs w:val="24"/>
+              <w:shd w:val="clear"/>
+              <w:lang w:val="en-US" w:eastAsia="zh-CN" w:bidi="ar-SA"/>
+            </w:rPr>
+            <w:t>I2C_</w:t>
+          </w:r>
+          <w:r>
+            <w:rPr>
+              <w:rFonts w:hint="eastAsia" w:ascii="Consolas" w:cstheme="minorBidi"/>
+              <w:color w:val="BB2726"/>
+              <w:kern w:val="2"/>
+              <w:sz w:val="21"/>
+              <w:szCs w:val="24"/>
+              <w:shd w:val="clear"/>
+              <w:lang w:val="en-US" w:eastAsia="zh-CN" w:bidi="ar-SA"/>
+            </w:rPr>
+            <w:t>REG</w:t>
+          </w:r>
+          <w:r>
+            <w:rPr>
+              <w:rFonts w:hint="eastAsia" w:ascii="Consolas" w:eastAsia="宋体" w:hAnsiTheme="minorAscii" w:cstheme="minorBidi"/>
+              <w:color w:val="BB2726"/>
+              <w:kern w:val="2"/>
+              <w:sz w:val="21"/>
+              <w:szCs w:val="24"/>
+              <w:shd w:val="clear"/>
+              <w:lang w:val="en-US" w:eastAsia="zh-CN" w:bidi="ar-SA"/>
+            </w:rPr>
+            <w:t>_SIZE_8BIT</w:t>
+          </w:r>
+          <w:r>
+            <w:rPr>
+              <w:rFonts w:hint="eastAsia" w:ascii="Consolas" w:eastAsia="宋体" w:hAnsiTheme="minorAscii" w:cstheme="minorBidi"/>
+              <w:color w:val="252525"/>
+              <w:kern w:val="2"/>
+              <w:sz w:val="21"/>
+              <w:szCs w:val="24"/>
+              <w:shd w:val="clear"/>
+              <w:lang w:val="en-US" w:eastAsia="zh-CN" w:bidi="ar-SA"/>
+            </w:rPr>
+            <w:t>,</w:t>
+          </w:r>
+          <w:r>
+            <w:rPr>
+              <w:rFonts w:hint="eastAsia" w:ascii="Consolas" w:eastAsia="宋体" w:hAnsiTheme="minorAscii" w:cstheme="minorBidi"/>
+              <w:color w:val="BB2726"/>
+              <w:kern w:val="2"/>
+              <w:sz w:val="21"/>
+              <w:szCs w:val="24"/>
+              <w:shd w:val="clear"/>
+              <w:lang w:val="en-US" w:eastAsia="zh-CN" w:bidi="ar-SA"/>
+            </w:rPr>
+            <w:t>rBuf</w:t>
+          </w:r>
+          <w:r>
+            <w:rPr>
+              <w:rFonts w:hint="eastAsia" w:ascii="Consolas" w:eastAsia="宋体" w:hAnsiTheme="minorAscii" w:cstheme="minorBidi"/>
+              <w:color w:val="252525"/>
+              <w:kern w:val="2"/>
+              <w:sz w:val="21"/>
+              <w:szCs w:val="24"/>
+              <w:shd w:val="clear"/>
+              <w:lang w:val="en-US" w:eastAsia="zh-CN" w:bidi="ar-SA"/>
+            </w:rPr>
+            <w:t>,</w:t>
+          </w:r>
+          <w:r>
+            <w:rPr>
+              <w:rFonts w:hint="eastAsia" w:ascii="Consolas" w:eastAsia="宋体" w:hAnsiTheme="minorAscii" w:cstheme="minorBidi"/>
+              <w:color w:val="C48200"/>
+              <w:kern w:val="2"/>
+              <w:sz w:val="21"/>
+              <w:szCs w:val="24"/>
+              <w:shd w:val="clear"/>
+              <w:lang w:val="en-US" w:eastAsia="zh-CN" w:bidi="ar-SA"/>
+            </w:rPr>
+            <w:t>2</w:t>
+          </w:r>
+          <w:r>
+            <w:rPr>
+              <w:rFonts w:hint="eastAsia" w:ascii="Consolas" w:eastAsia="宋体" w:hAnsiTheme="minorAscii" w:cstheme="minorBidi"/>
+              <w:color w:val="252525"/>
+              <w:kern w:val="2"/>
+              <w:sz w:val="21"/>
+              <w:szCs w:val="24"/>
+              <w:shd w:val="clear"/>
+              <w:lang w:val="en-US" w:eastAsia="zh-CN" w:bidi="ar-SA"/>
+            </w:rPr>
+            <w:t>);</w:t>
+          </w:r>
+        </w:p>
+        <w:p>
+          <w:pPr>
+            <w:shd w:val="clear" w:fill="F5F5F5"/>
+            <w:ind w:left="480" w:leftChars="200"/>
+            <w:rPr>
+              <w:rFonts w:hint="eastAsia" w:ascii="Consolas"/>
+              <w:sz w:val="21"/>
+              <w:shd w:val="clear"/>
+              <w:lang w:val="en-US" w:eastAsia="zh-CN"/>
+            </w:rPr>
+          </w:pPr>
+          <w:r>
+            <w:rPr>
+              <w:rFonts w:hint="eastAsia" w:ascii="Consolas" w:eastAsia="宋体" w:hAnsiTheme="minorAscii" w:cstheme="minorBidi"/>
+              <w:color w:val="909090"/>
+              <w:kern w:val="2"/>
+              <w:sz w:val="21"/>
+              <w:szCs w:val="24"/>
+              <w:shd w:val="clear"/>
+              <w:lang w:val="en-US" w:eastAsia="zh-CN" w:bidi="ar-SA"/>
+            </w:rPr>
+            <w:t>//DMA接收完成回调：HAL_I2C_MemRxCpltCallback(I2C_HandleTypeDef *hi2c)</w:t>
+          </w:r>
+        </w:p>
+      </w:sdtContent>
+    </w:sdt>
+    <w:p>
+      <w:pPr>
+        <w:pStyle w:val="2"/>
+        <w:bidi w:val="0"/>
+        <w:rPr>
+          <w:rFonts w:hint="eastAsia"/>
+          <w:lang w:val="en-US" w:eastAsia="zh-CN"/>
+        </w:rPr>
+      </w:pPr>
+      <w:r>
+        <w:rPr>
+          <w:rFonts w:hint="eastAsia"/>
+          <w:lang w:val="en-US" w:eastAsia="zh-CN"/>
+        </w:rPr>
         <w:t>SPI</w:t>
       </w:r>
+      <w:bookmarkStart w:id="0" w:name="_GoBack"/>
+      <w:bookmarkEnd w:id="0"/>
     </w:p>
     <w:p>
       <w:pPr>
@@ -8768,8 +11538,6 @@
         <w:pStyle w:val="3"/>
         <w:bidi w:val="0"/>
       </w:pPr>
-      <w:bookmarkStart w:id="0" w:name="_GoBack"/>
-      <w:bookmarkEnd w:id="0"/>
       <w:r>
         <w:t xml:space="preserve">HAL_ADC_GetValue() </w:t>
       </w:r>
@@ -9320,13 +12088,13 @@
       <w:sz w:val="28"/>
     </w:rPr>
   </w:style>
-  <w:style w:type="character" w:default="1" w:styleId="6">
+  <w:style w:type="character" w:default="1" w:styleId="7">
     <w:name w:val="Default Paragraph Font"/>
     <w:semiHidden/>
     <w:qFormat/>
     <w:uiPriority w:val="0"/>
   </w:style>
-  <w:style w:type="table" w:default="1" w:styleId="5">
+  <w:style w:type="table" w:default="1" w:styleId="6">
     <w:name w:val="Normal Table"/>
     <w:semiHidden/>
     <w:qFormat/>
@@ -9340,18 +12108,33 @@
       </w:tblCellMar>
     </w:tblPr>
   </w:style>
-  <w:style w:type="character" w:styleId="7">
+  <w:style w:type="paragraph" w:styleId="5">
+    <w:name w:val="Normal (Web)"/>
+    <w:basedOn w:val="1"/>
+    <w:uiPriority w:val="0"/>
+    <w:pPr>
+      <w:spacing w:before="0" w:beforeAutospacing="1" w:after="0" w:afterAutospacing="1"/>
+      <w:ind w:left="0" w:right="0"/>
+      <w:jc w:val="left"/>
+    </w:pPr>
+    <w:rPr>
+      <w:kern w:val="0"/>
+      <w:sz w:val="24"/>
+      <w:lang w:val="en-US" w:eastAsia="zh-CN" w:bidi="ar"/>
+    </w:rPr>
+  </w:style>
+  <w:style w:type="character" w:styleId="8">
     <w:name w:val="Strong"/>
-    <w:basedOn w:val="6"/>
+    <w:basedOn w:val="7"/>
     <w:qFormat/>
     <w:uiPriority w:val="0"/>
     <w:rPr>
       <w:b/>
     </w:rPr>
   </w:style>
-  <w:style w:type="character" w:styleId="8">
+  <w:style w:type="character" w:styleId="9">
     <w:name w:val="HTML Code"/>
-    <w:basedOn w:val="6"/>
+    <w:basedOn w:val="7"/>
     <w:qFormat/>
     <w:uiPriority w:val="0"/>
     <w:rPr>
@@ -9953,6 +12736,132 @@
         <w:p/>
       </w:docPartBody>
     </w:docPart>
+    <w:docPart>
+      <w:docPartPr>
+        <w:name w:val="{f12edd35-ed67-44cf-b75b-0e33027ec69f}"/>
+        <w:style w:val=""/>
+        <w:category>
+          <w:name w:val="常规"/>
+          <w:gallery w:val="placeholder"/>
+        </w:category>
+        <w:types>
+          <w:type w:val="bbPlcHdr"/>
+        </w:types>
+        <w:behaviors>
+          <w:behavior w:val="content"/>
+        </w:behaviors>
+        <w:description w:val=""/>
+        <w:guid w:val="{f12edd35-ed67-44cf-b75b-0e33027ec69f}"/>
+      </w:docPartPr>
+      <w:docPartBody>
+        <w:p/>
+      </w:docPartBody>
+    </w:docPart>
+    <w:docPart>
+      <w:docPartPr>
+        <w:name w:val="{779f9e51-5de6-4c8f-a2b5-51b7aadd9d60}"/>
+        <w:style w:val=""/>
+        <w:category>
+          <w:name w:val="常规"/>
+          <w:gallery w:val="placeholder"/>
+        </w:category>
+        <w:types>
+          <w:type w:val="bbPlcHdr"/>
+        </w:types>
+        <w:behaviors>
+          <w:behavior w:val="content"/>
+        </w:behaviors>
+        <w:description w:val=""/>
+        <w:guid w:val="{779f9e51-5de6-4c8f-a2b5-51b7aadd9d60}"/>
+      </w:docPartPr>
+      <w:docPartBody>
+        <w:p/>
+      </w:docPartBody>
+    </w:docPart>
+    <w:docPart>
+      <w:docPartPr>
+        <w:name w:val="{0bd8458a-c69b-4441-b41b-00058291b7f5}"/>
+        <w:style w:val=""/>
+        <w:category>
+          <w:name w:val="常规"/>
+          <w:gallery w:val="placeholder"/>
+        </w:category>
+        <w:types>
+          <w:type w:val="bbPlcHdr"/>
+        </w:types>
+        <w:behaviors>
+          <w:behavior w:val="content"/>
+        </w:behaviors>
+        <w:description w:val=""/>
+        <w:guid w:val="{0bd8458a-c69b-4441-b41b-00058291b7f5}"/>
+      </w:docPartPr>
+      <w:docPartBody>
+        <w:p/>
+      </w:docPartBody>
+    </w:docPart>
+    <w:docPart>
+      <w:docPartPr>
+        <w:name w:val="{8ef57f00-06e6-4c70-9a40-a49de4611b09}"/>
+        <w:style w:val=""/>
+        <w:category>
+          <w:name w:val="常规"/>
+          <w:gallery w:val="placeholder"/>
+        </w:category>
+        <w:types>
+          <w:type w:val="bbPlcHdr"/>
+        </w:types>
+        <w:behaviors>
+          <w:behavior w:val="content"/>
+        </w:behaviors>
+        <w:description w:val=""/>
+        <w:guid w:val="{8ef57f00-06e6-4c70-9a40-a49de4611b09}"/>
+      </w:docPartPr>
+      <w:docPartBody>
+        <w:p/>
+      </w:docPartBody>
+    </w:docPart>
+    <w:docPart>
+      <w:docPartPr>
+        <w:name w:val="{ff570d7e-b696-49ef-918e-facc973a3292}"/>
+        <w:style w:val=""/>
+        <w:category>
+          <w:name w:val="常规"/>
+          <w:gallery w:val="placeholder"/>
+        </w:category>
+        <w:types>
+          <w:type w:val="bbPlcHdr"/>
+        </w:types>
+        <w:behaviors>
+          <w:behavior w:val="content"/>
+        </w:behaviors>
+        <w:description w:val=""/>
+        <w:guid w:val="{ff570d7e-b696-49ef-918e-facc973a3292}"/>
+      </w:docPartPr>
+      <w:docPartBody>
+        <w:p/>
+      </w:docPartBody>
+    </w:docPart>
+    <w:docPart>
+      <w:docPartPr>
+        <w:name w:val="{89f6e782-d2fa-4a87-95b2-bdc26956baee}"/>
+        <w:style w:val=""/>
+        <w:category>
+          <w:name w:val="常规"/>
+          <w:gallery w:val="placeholder"/>
+        </w:category>
+        <w:types>
+          <w:type w:val="bbPlcHdr"/>
+        </w:types>
+        <w:behaviors>
+          <w:behavior w:val="content"/>
+        </w:behaviors>
+        <w:description w:val=""/>
+        <w:guid w:val="{89f6e782-d2fa-4a87-95b2-bdc26956baee}"/>
+      </w:docPartPr>
+      <w:docPartBody>
+        <w:p/>
+      </w:docPartBody>
+    </w:docPart>
   </w:docParts>
 </w:glossaryDocument>
 </file>
@@ -10328,6 +13237,12 @@
   <wpscustomsdt:sdtItem id="147471538" type="1" data="{&quot;codeLang&quot;:&quot;C&quot;,&quot;isDarkTheme&quot;:0}"/>
   <wpscustomsdt:sdtItem id="147471450" type="1" data="{&quot;codeLang&quot;:&quot;C++&quot;,&quot;isDarkTheme&quot;:0}"/>
   <wpscustomsdt:sdtItem id="147471333" type="1" data="{&quot;codeLang&quot;:&quot;C&quot;,&quot;isDarkTheme&quot;:0}"/>
+  <wpscustomsdt:sdtItem id="147456630" type="1" data="{&quot;codeLang&quot;:&quot;C&quot;,&quot;isDarkTheme&quot;:0}"/>
+  <wpscustomsdt:sdtItem id="147456349" type="1" data="{&quot;codeLang&quot;:&quot;C&quot;,&quot;isDarkTheme&quot;:0}"/>
+  <wpscustomsdt:sdtItem id="147455928" type="1" data="{&quot;codeLang&quot;:&quot;C&quot;,&quot;isDarkTheme&quot;:0}"/>
+  <wpscustomsdt:sdtItem id="147455673" type="1" data="{&quot;codeLang&quot;:&quot;C&quot;,&quot;isDarkTheme&quot;:0}"/>
+  <wpscustomsdt:sdtItem id="147455422" type="1" data="{&quot;codeLang&quot;:&quot;C&quot;,&quot;isDarkTheme&quot;:0}"/>
+  <wpscustomsdt:sdtItem id="147454755" type="1" data="{&quot;codeLang&quot;:&quot;C&quot;,&quot;isDarkTheme&quot;:0}"/>
   <wpscustomsdt:sdtItem id="147453835" type="1" data="{&quot;codeLang&quot;:&quot;C&quot;,&quot;isDarkTheme&quot;:0}"/>
   <wpscustomsdt:sdtItem id="147453825" type="1" data="{&quot;codeLang&quot;:&quot;C&quot;,&quot;isDarkTheme&quot;:0}"/>
   <wpscustomsdt:sdtItem id="147453812" type="1" data="{&quot;codeLang&quot;:&quot;C&quot;,&quot;isDarkTheme&quot;:0}"/>

</xml_diff>